<commit_message>
docs: compile and add Phase 5 progress report with visual subpages screenshots
</commit_message>
<xml_diff>
--- a/docs/Progress_Report_Mohamed_Mostafa.docx
+++ b/docs/Progress_Report_Mohamed_Mostafa.docx
@@ -13,7 +13,7 @@
           <w:color w:val="0E7C86"/>
           <w:sz w:val="36"/>
         </w:rPr>
-        <w:t>Progress Report: Database Setup, Seeding, and Admin REST APIs (Phases 1 &amp; 2)</w:t>
+        <w:t>Progress Report: Full Admin Panel Development (Phases 1 - 5)</w:t>
       </w:r>
     </w:p>
     <w:p>
@@ -28,7 +28,7 @@
         <w:t xml:space="preserve">Project Title: </w:t>
       </w:r>
       <w:r>
-        <w:t>AI Healthcare Platform Project</w:t>
+        <w:t>AI Healthcare Platform Porject</w:t>
       </w:r>
     </w:p>
     <w:p>
@@ -58,7 +58,7 @@
         <w:t xml:space="preserve">Date: </w:t>
       </w:r>
       <w:r>
-        <w:t>March 7, 2026 (3/7/2026)</w:t>
+        <w:t>3/7/2026</w:t>
       </w:r>
     </w:p>
     <w:p>
@@ -88,7 +88,7 @@
         <w:t xml:space="preserve">Next Objective: </w:t>
       </w:r>
       <w:r>
-        <w:t>Phase 3 — Admin Frontend Setup &amp; Layout</w:t>
+        <w:t>Phase 6 — QA Auditing &amp; Test Scenarios</w:t>
       </w:r>
     </w:p>
     <w:p>
@@ -122,10 +122,10 @@
         <w:spacing w:after="240"/>
       </w:pPr>
       <w:r>
-        <w:t>This report summarizes the completed backend milestones for Phase 1 (Database Setup &amp; Seeding) and Phase 2 (ESM Refactoring &amp; Admin REST APIs) of the AI Healthcare Platform Project.</w:t>
+        <w:t>This progress report summarizes the full implementation milestones for Member 7's assigned Admin Dashboard Panel module (covering database seeding, REST controllers, responsive React layout integration, live catalog CRUD pages, transaction fulfillments, and form validation error-handling shields).</w:t>
         <w:br/>
         <w:br/>
-        <w:t>All database schemas (Mongoose models), connection managers, and automated mock database seeding utilities have been implemented. The backend server codebase has been converted to use native ES Modules (ESM). Additionally, we have created complete admin-specific REST controllers and routes, fully secured behind JWT validation (protect) and role checking (isAdmin) middleware guards. The server is verified operational and pushed to the remote repository.</w:t>
+        <w:t>All admin-facing modules have been fully completed, verified via automated builds, and deployed. The frontend interfaces actively query the backend APIs, rendering live MongoDB database seed records in responsive, modern tables. In accordance with QA requirements, form validation layers, action lockouts, connection failure fallback screens, and custom confirm dialogues are in place.</w:t>
       </w:r>
     </w:p>
     <w:p>
@@ -139,7 +139,7 @@
           <w:color w:val="0E7C86"/>
           <w:sz w:val="28"/>
         </w:rPr>
-        <w:t>2. Key Achievements</w:t>
+        <w:t>2. Core Milestones Completed</w:t>
       </w:r>
     </w:p>
     <w:p>
@@ -153,15 +153,7 @@
           <w:color w:val="2E75B6"/>
           <w:sz w:val="24"/>
         </w:rPr>
-        <w:t>A. ES Modules (ESM) Transition &amp; Server Initialization</w:t>
-      </w:r>
-    </w:p>
-    <w:p>
-      <w:pPr>
-        <w:spacing w:after="80"/>
-      </w:pPr>
-      <w:r>
-        <w:t>To match the repository's migration standards, all active backend scripts were refactored to use ES Modules:</w:t>
+        <w:t>A. Database Seeding &amp; Schema Setup (Phase 1)</w:t>
       </w:r>
     </w:p>
     <w:p>
@@ -169,23 +161,7 @@
         <w:pStyle w:val="ListBullet"/>
       </w:pPr>
       <w:r>
-        <w:t>Configured "type": "module" in package.json.</w:t>
-      </w:r>
-    </w:p>
-    <w:p>
-      <w:pPr>
-        <w:pStyle w:val="ListBullet"/>
-      </w:pPr>
-      <w:r>
-        <w:t>Converted the main server.js entry point, database setup, routing files, utility helpers, and middlewares to ESM.</w:t>
-      </w:r>
-    </w:p>
-    <w:p>
-      <w:pPr>
-        <w:pStyle w:val="ListBullet"/>
-      </w:pPr>
-      <w:r>
-        <w:t>Terminated duplicate CommonJS data files (such as labTests.js).</w:t>
+        <w:t>Defined standard Mongoose schemas for all 10 project collections (User, Doctor, Appointment with double-booking prevention, Medicine, Order with historical price snapshots, LabTest, LabBooking, EmergencyContact, Blog, and ContactMessage). Created an automated master seed script to clear and populate database records.</w:t>
       </w:r>
     </w:p>
     <w:p>
@@ -199,165 +175,15 @@
           <w:color w:val="2E75B6"/>
           <w:sz w:val="24"/>
         </w:rPr>
-        <w:t>B. Database Models &amp; Schema Setup</w:t>
-      </w:r>
-    </w:p>
-    <w:p>
-      <w:pPr>
-        <w:spacing w:after="80"/>
-      </w:pPr>
-      <w:r>
-        <w:t>Created robust Mongoose models with validation layers, type safety, and custom indexes:</w:t>
+        <w:t>B. ES Modules Backend APIs (Phase 2)</w:t>
       </w:r>
     </w:p>
     <w:p>
       <w:pPr>
         <w:pStyle w:val="ListBullet"/>
-        <w:spacing w:after="80"/>
       </w:pPr>
       <w:r>
-        <w:rPr>
-          <w:b/>
-        </w:rPr>
-        <w:t xml:space="preserve">User: </w:t>
-      </w:r>
-      <w:r>
-        <w:t>Enforces email uniqueness and safety controls (excluding password hashes by default).</w:t>
-      </w:r>
-    </w:p>
-    <w:p>
-      <w:pPr>
-        <w:pStyle w:val="ListBullet"/>
-        <w:spacing w:after="80"/>
-      </w:pPr>
-      <w:r>
-        <w:rPr>
-          <w:b/>
-        </w:rPr>
-        <w:t xml:space="preserve">Doctor: </w:t>
-      </w:r>
-      <w:r>
-        <w:t>Houses qualifications, fees, availability tables, and average rating aggregations.</w:t>
-      </w:r>
-    </w:p>
-    <w:p>
-      <w:pPr>
-        <w:pStyle w:val="ListBullet"/>
-        <w:spacing w:after="80"/>
-      </w:pPr>
-      <w:r>
-        <w:rPr>
-          <w:b/>
-        </w:rPr>
-        <w:t xml:space="preserve">Appointment: </w:t>
-      </w:r>
-      <w:r>
-        <w:t>Employs a unique compound index { doctorId, date, timeSlot } to prevent concurrent double-bookings.</w:t>
-      </w:r>
-    </w:p>
-    <w:p>
-      <w:pPr>
-        <w:pStyle w:val="ListBullet"/>
-        <w:spacing w:after="80"/>
-      </w:pPr>
-      <w:r>
-        <w:rPr>
-          <w:b/>
-        </w:rPr>
-        <w:t xml:space="preserve">Medicine: </w:t>
-      </w:r>
-      <w:r>
-        <w:t>Manages inventory stock counts, categories, pricing, and prescription requirements.</w:t>
-      </w:r>
-    </w:p>
-    <w:p>
-      <w:pPr>
-        <w:pStyle w:val="ListBullet"/>
-        <w:spacing w:after="80"/>
-      </w:pPr>
-      <w:r>
-        <w:rPr>
-          <w:b/>
-        </w:rPr>
-        <w:t xml:space="preserve">Order: </w:t>
-      </w:r>
-      <w:r>
-        <w:t>Captures snapshots of purchased medicines to preserve historical price integrity and validates totals.</w:t>
-      </w:r>
-    </w:p>
-    <w:p>
-      <w:pPr>
-        <w:pStyle w:val="ListBullet"/>
-        <w:spacing w:after="80"/>
-      </w:pPr>
-      <w:r>
-        <w:rPr>
-          <w:b/>
-        </w:rPr>
-        <w:t xml:space="preserve">LabTest: </w:t>
-      </w:r>
-      <w:r>
-        <w:t>Holds clinical diagnostic tests catalogued by categories.</w:t>
-      </w:r>
-    </w:p>
-    <w:p>
-      <w:pPr>
-        <w:pStyle w:val="ListBullet"/>
-        <w:spacing w:after="80"/>
-      </w:pPr>
-      <w:r>
-        <w:rPr>
-          <w:b/>
-        </w:rPr>
-        <w:t xml:space="preserve">LabBooking: </w:t>
-      </w:r>
-      <w:r>
-        <w:t>Coordinates lab scheduling for registered users and guest checkout flows.</w:t>
-      </w:r>
-    </w:p>
-    <w:p>
-      <w:pPr>
-        <w:pStyle w:val="ListBullet"/>
-        <w:spacing w:after="80"/>
-      </w:pPr>
-      <w:r>
-        <w:rPr>
-          <w:b/>
-        </w:rPr>
-        <w:t xml:space="preserve">EmergencyContact: </w:t>
-      </w:r>
-      <w:r>
-        <w:t>Organizes blood banks, ambulance services, hospitals, and police contacts.</w:t>
-      </w:r>
-    </w:p>
-    <w:p>
-      <w:pPr>
-        <w:pStyle w:val="ListBullet"/>
-        <w:spacing w:after="80"/>
-      </w:pPr>
-      <w:r>
-        <w:rPr>
-          <w:b/>
-        </w:rPr>
-        <w:t xml:space="preserve">Blog: </w:t>
-      </w:r>
-      <w:r>
-        <w:t>Supports categories, cover images, excerpts, and search-friendly slugs.</w:t>
-      </w:r>
-    </w:p>
-    <w:p>
-      <w:pPr>
-        <w:pStyle w:val="ListBullet"/>
-        <w:spacing w:after="80"/>
-      </w:pPr>
-      <w:r>
-        <w:rPr>
-          <w:b/>
-        </w:rPr>
-        <w:t xml:space="preserve">ContactMessage: </w:t>
-      </w:r>
-      <w:r>
-        <w:t>Logs patient inquiries and unread inquiries indicators.</w:t>
+        <w:t>Refactored the entire backend server configuration and routing folders to native ES Modules (ESM). Implemented secure REST controller routes under /api/admin/* (Doctors CRUD, Medicines CRUD, Blogs CRUD, and status fulfillments for appointments, lab tests, and orders) guarded behind JWT authentication and role-checking middleware.</w:t>
       </w:r>
     </w:p>
     <w:p>
@@ -371,15 +197,7 @@
           <w:color w:val="2E75B6"/>
           <w:sz w:val="24"/>
         </w:rPr>
-        <w:t>C. Seeding System &amp; Mock Data Orchestration</w:t>
-      </w:r>
-    </w:p>
-    <w:p>
-      <w:pPr>
-        <w:spacing w:after="80"/>
-      </w:pPr>
-      <w:r>
-        <w:t>Developed a master seed coordinator (seed.js) that drops collections and populates the database with structured mock datasets:</w:t>
+        <w:t>C. Layout Shell &amp; Analytics Graphs (Phase 3)</w:t>
       </w:r>
     </w:p>
     <w:p>
@@ -387,15 +205,7 @@
         <w:pStyle w:val="ListBullet"/>
       </w:pPr>
       <w:r>
-        <w:t>Seeded default patient credentials (patient@healthcare.com) and admin credentials (admin@healthcare.com) with hashed password salts using bcryptjs.</w:t>
-      </w:r>
-    </w:p>
-    <w:p>
-      <w:pPr>
-        <w:pStyle w:val="ListBullet"/>
-      </w:pPr>
-      <w:r>
-        <w:t>Populated mock transactional logs (1 appointment, 1 order, 1 lab booking, 1 contact inquiry) to verify search logic.</w:t>
+        <w:t>Constructed a premium, responsive React admin shell layout (AdminLayout.jsx) with a left navigation sidebar drawer (AdminSidebar.jsx). Integrated dynamic weekly clinics activity area charts and lab test loads bar charts using the Recharts library on the Dashboard.</w:t>
       </w:r>
     </w:p>
     <w:p>
@@ -409,15 +219,7 @@
           <w:color w:val="2E75B6"/>
           <w:sz w:val="24"/>
         </w:rPr>
-        <w:t>D. Admin REST API Implementation</w:t>
-      </w:r>
-    </w:p>
-    <w:p>
-      <w:pPr>
-        <w:spacing w:after="80"/>
-      </w:pPr>
-      <w:r>
-        <w:t>Developed Express routing endpoints for clinic administrators:</w:t>
+        <w:t>D. Live Collection CRUD pages (Phase 4)</w:t>
       </w:r>
     </w:p>
     <w:p>
@@ -425,7 +227,21 @@
         <w:pStyle w:val="ListBullet"/>
       </w:pPr>
       <w:r>
-        <w:t>Doctors CRUD: POST /, PUT /:id, DELETE /:id (soft-deletes doctor profiles using isActive = false).</w:t>
+        <w:t>Designed and mapped all administrative subpages. Enhanced the backend API with paginated GET list routes for all collections. Converted frontend placeholders to render active database records dynamically.</w:t>
+      </w:r>
+    </w:p>
+    <w:p>
+      <w:pPr>
+        <w:keepNext/>
+        <w:spacing w:before="240" w:after="120"/>
+      </w:pPr>
+      <w:r>
+        <w:rPr>
+          <w:b/>
+          <w:color w:val="2E75B6"/>
+          <w:sz w:val="24"/>
+        </w:rPr>
+        <w:t>E. Form Validations &amp; QA Error Shields (Phase 5)</w:t>
       </w:r>
     </w:p>
     <w:p>
@@ -433,31 +249,7 @@
         <w:pStyle w:val="ListBullet"/>
       </w:pPr>
       <w:r>
-        <w:t>Medicines CRUD: POST /medicines, PUT /medicines/:id, DELETE /medicines/:id (soft-deletes catalog items using isActive = false).</w:t>
-      </w:r>
-    </w:p>
-    <w:p>
-      <w:pPr>
-        <w:pStyle w:val="ListBullet"/>
-      </w:pPr>
-      <w:r>
-        <w:t>Blogs CRUD: POST /blogs, PUT /blogs/:id, DELETE /blogs/:id (soft-deletes posts by resetting status to "draft").</w:t>
-      </w:r>
-    </w:p>
-    <w:p>
-      <w:pPr>
-        <w:pStyle w:val="ListBullet"/>
-      </w:pPr>
-      <w:r>
-        <w:t>Fulfillment States: PATCH /appointments/:id/status, PATCH /orders/:id/status, and PATCH /lab-bookings/:id/status (updates scheduling/delivery enums).</w:t>
-      </w:r>
-    </w:p>
-    <w:p>
-      <w:pPr>
-        <w:pStyle w:val="ListBullet"/>
-      </w:pPr>
-      <w:r>
-        <w:t>Support Inquiries View: GET /messages (returns paginated user messages list, newest first).</w:t>
+        <w:t>Harkened input fields against empty inputs or negative values. Prevented double submits by locking click triggers. Created custom absolute-overlay deactivation popups, and added connection failure error-warning banners if API requests fail.</w:t>
       </w:r>
     </w:p>
     <w:p>
@@ -471,1192 +263,367 @@
           <w:color w:val="0E7C86"/>
           <w:sz w:val="28"/>
         </w:rPr>
-        <w:t>3. Route Access &amp; Authorization Matrix</w:t>
+        <w:t>3. Implementation Visual Gallery (Screenshots)</w:t>
       </w:r>
     </w:p>
-    <w:tbl>
-      <w:tblPr>
-        <w:tblW w:type="auto" w:w="0"/>
-        <w:tblLayout w:type="fixed"/>
-        <w:tblLook w:firstColumn="1" w:firstRow="1" w:lastColumn="0" w:lastRow="0" w:noHBand="0" w:noVBand="1" w:val="04A0"/>
-      </w:tblPr>
-      <w:tblGrid>
-        <w:gridCol w:w="2340"/>
-        <w:gridCol w:w="2340"/>
-        <w:gridCol w:w="2340"/>
-        <w:gridCol w:w="2340"/>
-      </w:tblGrid>
-      <w:tr>
-        <w:tc>
-          <w:tcPr>
-            <w:tcW w:type="dxa" w:w="3168"/>
-            <w:shd w:fill="0E7C86"/>
-            <w:tcMar>
-              <w:top w:w="100" w:type="dxa"/>
-              <w:bottom w:w="100" w:type="dxa"/>
-              <w:left w:w="150" w:type="dxa"/>
-              <w:right w:w="150" w:type="dxa"/>
-            </w:tcMar>
-          </w:tcPr>
-          <w:p>
-            <w:r>
-              <w:rPr>
-                <w:b/>
-                <w:color w:val="FFFFFF"/>
-                <w:sz w:val="19"/>
-              </w:rPr>
-              <w:t>Endpoint</w:t>
-            </w:r>
-          </w:p>
-        </w:tc>
-        <w:tc>
-          <w:tcPr>
-            <w:tcW w:type="dxa" w:w="1152"/>
-            <w:shd w:fill="0E7C86"/>
-            <w:tcMar>
-              <w:top w:w="100" w:type="dxa"/>
-              <w:bottom w:w="100" w:type="dxa"/>
-              <w:left w:w="150" w:type="dxa"/>
-              <w:right w:w="150" w:type="dxa"/>
-            </w:tcMar>
-          </w:tcPr>
-          <w:p>
-            <w:r>
-              <w:rPr>
-                <w:b/>
-                <w:color w:val="FFFFFF"/>
-                <w:sz w:val="19"/>
-              </w:rPr>
-              <w:t>Method</w:t>
-            </w:r>
-          </w:p>
-        </w:tc>
-        <w:tc>
-          <w:tcPr>
-            <w:tcW w:type="dxa" w:w="2592"/>
-            <w:shd w:fill="0E7C86"/>
-            <w:tcMar>
-              <w:top w:w="100" w:type="dxa"/>
-              <w:bottom w:w="100" w:type="dxa"/>
-              <w:left w:w="150" w:type="dxa"/>
-              <w:right w:w="150" w:type="dxa"/>
-            </w:tcMar>
-          </w:tcPr>
-          <w:p>
-            <w:r>
-              <w:rPr>
-                <w:b/>
-                <w:color w:val="FFFFFF"/>
-                <w:sz w:val="19"/>
-              </w:rPr>
-              <w:t>Security</w:t>
-            </w:r>
-          </w:p>
-        </w:tc>
-        <w:tc>
-          <w:tcPr>
-            <w:tcW w:type="dxa" w:w="3168"/>
-            <w:shd w:fill="0E7C86"/>
-            <w:tcMar>
-              <w:top w:w="100" w:type="dxa"/>
-              <w:bottom w:w="100" w:type="dxa"/>
-              <w:left w:w="150" w:type="dxa"/>
-              <w:right w:w="150" w:type="dxa"/>
-            </w:tcMar>
-          </w:tcPr>
-          <w:p>
-            <w:r>
-              <w:rPr>
-                <w:b/>
-                <w:color w:val="FFFFFF"/>
-                <w:sz w:val="19"/>
-              </w:rPr>
-              <w:t>Purpose / Action</w:t>
-            </w:r>
-          </w:p>
-        </w:tc>
-      </w:tr>
-      <w:tr>
-        <w:tc>
-          <w:tcPr>
-            <w:tcW w:type="dxa" w:w="3168"/>
-            <w:tcMar>
-              <w:top w:w="100" w:type="dxa"/>
-              <w:bottom w:w="100" w:type="dxa"/>
-              <w:left w:w="150" w:type="dxa"/>
-              <w:right w:w="150" w:type="dxa"/>
-            </w:tcMar>
-          </w:tcPr>
-          <w:p>
-            <w:r>
-              <w:rPr>
-                <w:rFonts w:ascii="Consolas" w:hAnsi="Consolas"/>
-                <w:b/>
-                <w:sz w:val="17"/>
-              </w:rPr>
-              <w:t>/api/admin/doctors</w:t>
-            </w:r>
-          </w:p>
-        </w:tc>
-        <w:tc>
-          <w:tcPr>
-            <w:tcW w:type="dxa" w:w="1152"/>
-            <w:tcMar>
-              <w:top w:w="100" w:type="dxa"/>
-              <w:bottom w:w="100" w:type="dxa"/>
-              <w:left w:w="150" w:type="dxa"/>
-              <w:right w:w="150" w:type="dxa"/>
-            </w:tcMar>
-          </w:tcPr>
-          <w:p>
-            <w:r>
-              <w:rPr>
-                <w:b/>
-                <w:sz w:val="18"/>
-              </w:rPr>
-              <w:t>POST</w:t>
-            </w:r>
-          </w:p>
-        </w:tc>
-        <w:tc>
-          <w:tcPr>
-            <w:tcW w:type="dxa" w:w="2592"/>
-            <w:tcMar>
-              <w:top w:w="100" w:type="dxa"/>
-              <w:bottom w:w="100" w:type="dxa"/>
-              <w:left w:w="150" w:type="dxa"/>
-              <w:right w:w="150" w:type="dxa"/>
-            </w:tcMar>
-          </w:tcPr>
-          <w:p>
-            <w:r>
-              <w:rPr>
-                <w:sz w:val="18"/>
-              </w:rPr>
-              <w:t>protect, isAdmin</w:t>
-            </w:r>
-          </w:p>
-        </w:tc>
-        <w:tc>
-          <w:tcPr>
-            <w:tcW w:type="dxa" w:w="3168"/>
-            <w:tcMar>
-              <w:top w:w="100" w:type="dxa"/>
-              <w:bottom w:w="100" w:type="dxa"/>
-              <w:left w:w="150" w:type="dxa"/>
-              <w:right w:w="150" w:type="dxa"/>
-            </w:tcMar>
-          </w:tcPr>
-          <w:p>
-            <w:r>
-              <w:rPr>
-                <w:sz w:val="18"/>
-              </w:rPr>
-              <w:t>Create a new doctor profile</w:t>
-            </w:r>
-          </w:p>
-        </w:tc>
-      </w:tr>
-      <w:tr>
-        <w:tc>
-          <w:tcPr>
-            <w:tcW w:type="dxa" w:w="3168"/>
-            <w:tcMar>
-              <w:top w:w="100" w:type="dxa"/>
-              <w:bottom w:w="100" w:type="dxa"/>
-              <w:left w:w="150" w:type="dxa"/>
-              <w:right w:w="150" w:type="dxa"/>
-            </w:tcMar>
-            <w:shd w:fill="F4F9F9"/>
-          </w:tcPr>
-          <w:p>
-            <w:r>
-              <w:rPr>
-                <w:rFonts w:ascii="Consolas" w:hAnsi="Consolas"/>
-                <w:b/>
-                <w:sz w:val="17"/>
-              </w:rPr>
-              <w:t>/api/admin/doctors/:id</w:t>
-            </w:r>
-          </w:p>
-        </w:tc>
-        <w:tc>
-          <w:tcPr>
-            <w:tcW w:type="dxa" w:w="1152"/>
-            <w:tcMar>
-              <w:top w:w="100" w:type="dxa"/>
-              <w:bottom w:w="100" w:type="dxa"/>
-              <w:left w:w="150" w:type="dxa"/>
-              <w:right w:w="150" w:type="dxa"/>
-            </w:tcMar>
-            <w:shd w:fill="F4F9F9"/>
-          </w:tcPr>
-          <w:p>
-            <w:r>
-              <w:rPr>
-                <w:b/>
-                <w:sz w:val="18"/>
-              </w:rPr>
-              <w:t>PUT</w:t>
-            </w:r>
-          </w:p>
-        </w:tc>
-        <w:tc>
-          <w:tcPr>
-            <w:tcW w:type="dxa" w:w="2592"/>
-            <w:tcMar>
-              <w:top w:w="100" w:type="dxa"/>
-              <w:bottom w:w="100" w:type="dxa"/>
-              <w:left w:w="150" w:type="dxa"/>
-              <w:right w:w="150" w:type="dxa"/>
-            </w:tcMar>
-            <w:shd w:fill="F4F9F9"/>
-          </w:tcPr>
-          <w:p>
-            <w:r>
-              <w:rPr>
-                <w:sz w:val="18"/>
-              </w:rPr>
-              <w:t>protect, isAdmin</w:t>
-            </w:r>
-          </w:p>
-        </w:tc>
-        <w:tc>
-          <w:tcPr>
-            <w:tcW w:type="dxa" w:w="3168"/>
-            <w:tcMar>
-              <w:top w:w="100" w:type="dxa"/>
-              <w:bottom w:w="100" w:type="dxa"/>
-              <w:left w:w="150" w:type="dxa"/>
-              <w:right w:w="150" w:type="dxa"/>
-            </w:tcMar>
-            <w:shd w:fill="F4F9F9"/>
-          </w:tcPr>
-          <w:p>
-            <w:r>
-              <w:rPr>
-                <w:sz w:val="18"/>
-              </w:rPr>
-              <w:t>Update details of a doctor profile</w:t>
-            </w:r>
-          </w:p>
-        </w:tc>
-      </w:tr>
-      <w:tr>
-        <w:tc>
-          <w:tcPr>
-            <w:tcW w:type="dxa" w:w="3168"/>
-            <w:tcMar>
-              <w:top w:w="100" w:type="dxa"/>
-              <w:bottom w:w="100" w:type="dxa"/>
-              <w:left w:w="150" w:type="dxa"/>
-              <w:right w:w="150" w:type="dxa"/>
-            </w:tcMar>
-          </w:tcPr>
-          <w:p>
-            <w:r>
-              <w:rPr>
-                <w:rFonts w:ascii="Consolas" w:hAnsi="Consolas"/>
-                <w:b/>
-                <w:sz w:val="17"/>
-              </w:rPr>
-              <w:t>/api/admin/doctors/:id</w:t>
-            </w:r>
-          </w:p>
-        </w:tc>
-        <w:tc>
-          <w:tcPr>
-            <w:tcW w:type="dxa" w:w="1152"/>
-            <w:tcMar>
-              <w:top w:w="100" w:type="dxa"/>
-              <w:bottom w:w="100" w:type="dxa"/>
-              <w:left w:w="150" w:type="dxa"/>
-              <w:right w:w="150" w:type="dxa"/>
-            </w:tcMar>
-          </w:tcPr>
-          <w:p>
-            <w:r>
-              <w:rPr>
-                <w:b/>
-                <w:sz w:val="18"/>
-              </w:rPr>
-              <w:t>DELETE</w:t>
-            </w:r>
-          </w:p>
-        </w:tc>
-        <w:tc>
-          <w:tcPr>
-            <w:tcW w:type="dxa" w:w="2592"/>
-            <w:tcMar>
-              <w:top w:w="100" w:type="dxa"/>
-              <w:bottom w:w="100" w:type="dxa"/>
-              <w:left w:w="150" w:type="dxa"/>
-              <w:right w:w="150" w:type="dxa"/>
-            </w:tcMar>
-          </w:tcPr>
-          <w:p>
-            <w:r>
-              <w:rPr>
-                <w:sz w:val="18"/>
-              </w:rPr>
-              <w:t>protect, isAdmin</w:t>
-            </w:r>
-          </w:p>
-        </w:tc>
-        <w:tc>
-          <w:tcPr>
-            <w:tcW w:type="dxa" w:w="3168"/>
-            <w:tcMar>
-              <w:top w:w="100" w:type="dxa"/>
-              <w:bottom w:w="100" w:type="dxa"/>
-              <w:left w:w="150" w:type="dxa"/>
-              <w:right w:w="150" w:type="dxa"/>
-            </w:tcMar>
-          </w:tcPr>
-          <w:p>
-            <w:r>
-              <w:rPr>
-                <w:sz w:val="18"/>
-              </w:rPr>
-              <w:t>Soft-delete a doctor (sets isActive: false)</w:t>
-            </w:r>
-          </w:p>
-        </w:tc>
-      </w:tr>
-      <w:tr>
-        <w:tc>
-          <w:tcPr>
-            <w:tcW w:type="dxa" w:w="3168"/>
-            <w:tcMar>
-              <w:top w:w="100" w:type="dxa"/>
-              <w:bottom w:w="100" w:type="dxa"/>
-              <w:left w:w="150" w:type="dxa"/>
-              <w:right w:w="150" w:type="dxa"/>
-            </w:tcMar>
-            <w:shd w:fill="F4F9F9"/>
-          </w:tcPr>
-          <w:p>
-            <w:r>
-              <w:rPr>
-                <w:rFonts w:ascii="Consolas" w:hAnsi="Consolas"/>
-                <w:b/>
-                <w:sz w:val="17"/>
-              </w:rPr>
-              <w:t>/api/admin/medicines</w:t>
-            </w:r>
-          </w:p>
-        </w:tc>
-        <w:tc>
-          <w:tcPr>
-            <w:tcW w:type="dxa" w:w="1152"/>
-            <w:tcMar>
-              <w:top w:w="100" w:type="dxa"/>
-              <w:bottom w:w="100" w:type="dxa"/>
-              <w:left w:w="150" w:type="dxa"/>
-              <w:right w:w="150" w:type="dxa"/>
-            </w:tcMar>
-            <w:shd w:fill="F4F9F9"/>
-          </w:tcPr>
-          <w:p>
-            <w:r>
-              <w:rPr>
-                <w:b/>
-                <w:sz w:val="18"/>
-              </w:rPr>
-              <w:t>POST</w:t>
-            </w:r>
-          </w:p>
-        </w:tc>
-        <w:tc>
-          <w:tcPr>
-            <w:tcW w:type="dxa" w:w="2592"/>
-            <w:tcMar>
-              <w:top w:w="100" w:type="dxa"/>
-              <w:bottom w:w="100" w:type="dxa"/>
-              <w:left w:w="150" w:type="dxa"/>
-              <w:right w:w="150" w:type="dxa"/>
-            </w:tcMar>
-            <w:shd w:fill="F4F9F9"/>
-          </w:tcPr>
-          <w:p>
-            <w:r>
-              <w:rPr>
-                <w:sz w:val="18"/>
-              </w:rPr>
-              <w:t>protect, isAdmin</w:t>
-            </w:r>
-          </w:p>
-        </w:tc>
-        <w:tc>
-          <w:tcPr>
-            <w:tcW w:type="dxa" w:w="3168"/>
-            <w:tcMar>
-              <w:top w:w="100" w:type="dxa"/>
-              <w:bottom w:w="100" w:type="dxa"/>
-              <w:left w:w="150" w:type="dxa"/>
-              <w:right w:w="150" w:type="dxa"/>
-            </w:tcMar>
-            <w:shd w:fill="F4F9F9"/>
-          </w:tcPr>
-          <w:p>
-            <w:r>
-              <w:rPr>
-                <w:sz w:val="18"/>
-              </w:rPr>
-              <w:t>Create a new medicine entry</w:t>
-            </w:r>
-          </w:p>
-        </w:tc>
-      </w:tr>
-      <w:tr>
-        <w:tc>
-          <w:tcPr>
-            <w:tcW w:type="dxa" w:w="3168"/>
-            <w:tcMar>
-              <w:top w:w="100" w:type="dxa"/>
-              <w:bottom w:w="100" w:type="dxa"/>
-              <w:left w:w="150" w:type="dxa"/>
-              <w:right w:w="150" w:type="dxa"/>
-            </w:tcMar>
-          </w:tcPr>
-          <w:p>
-            <w:r>
-              <w:rPr>
-                <w:rFonts w:ascii="Consolas" w:hAnsi="Consolas"/>
-                <w:b/>
-                <w:sz w:val="17"/>
-              </w:rPr>
-              <w:t>/api/admin/medicines/:id</w:t>
-            </w:r>
-          </w:p>
-        </w:tc>
-        <w:tc>
-          <w:tcPr>
-            <w:tcW w:type="dxa" w:w="1152"/>
-            <w:tcMar>
-              <w:top w:w="100" w:type="dxa"/>
-              <w:bottom w:w="100" w:type="dxa"/>
-              <w:left w:w="150" w:type="dxa"/>
-              <w:right w:w="150" w:type="dxa"/>
-            </w:tcMar>
-          </w:tcPr>
-          <w:p>
-            <w:r>
-              <w:rPr>
-                <w:b/>
-                <w:sz w:val="18"/>
-              </w:rPr>
-              <w:t>PUT</w:t>
-            </w:r>
-          </w:p>
-        </w:tc>
-        <w:tc>
-          <w:tcPr>
-            <w:tcW w:type="dxa" w:w="2592"/>
-            <w:tcMar>
-              <w:top w:w="100" w:type="dxa"/>
-              <w:bottom w:w="100" w:type="dxa"/>
-              <w:left w:w="150" w:type="dxa"/>
-              <w:right w:w="150" w:type="dxa"/>
-            </w:tcMar>
-          </w:tcPr>
-          <w:p>
-            <w:r>
-              <w:rPr>
-                <w:sz w:val="18"/>
-              </w:rPr>
-              <w:t>protect, isAdmin</w:t>
-            </w:r>
-          </w:p>
-        </w:tc>
-        <w:tc>
-          <w:tcPr>
-            <w:tcW w:type="dxa" w:w="3168"/>
-            <w:tcMar>
-              <w:top w:w="100" w:type="dxa"/>
-              <w:bottom w:w="100" w:type="dxa"/>
-              <w:left w:w="150" w:type="dxa"/>
-              <w:right w:w="150" w:type="dxa"/>
-            </w:tcMar>
-          </w:tcPr>
-          <w:p>
-            <w:r>
-              <w:rPr>
-                <w:sz w:val="18"/>
-              </w:rPr>
-              <w:t>Update a medicine catalog item</w:t>
-            </w:r>
-          </w:p>
-        </w:tc>
-      </w:tr>
-      <w:tr>
-        <w:tc>
-          <w:tcPr>
-            <w:tcW w:type="dxa" w:w="3168"/>
-            <w:tcMar>
-              <w:top w:w="100" w:type="dxa"/>
-              <w:bottom w:w="100" w:type="dxa"/>
-              <w:left w:w="150" w:type="dxa"/>
-              <w:right w:w="150" w:type="dxa"/>
-            </w:tcMar>
-            <w:shd w:fill="F4F9F9"/>
-          </w:tcPr>
-          <w:p>
-            <w:r>
-              <w:rPr>
-                <w:rFonts w:ascii="Consolas" w:hAnsi="Consolas"/>
-                <w:b/>
-                <w:sz w:val="17"/>
-              </w:rPr>
-              <w:t>/api/admin/medicines/:id</w:t>
-            </w:r>
-          </w:p>
-        </w:tc>
-        <w:tc>
-          <w:tcPr>
-            <w:tcW w:type="dxa" w:w="1152"/>
-            <w:tcMar>
-              <w:top w:w="100" w:type="dxa"/>
-              <w:bottom w:w="100" w:type="dxa"/>
-              <w:left w:w="150" w:type="dxa"/>
-              <w:right w:w="150" w:type="dxa"/>
-            </w:tcMar>
-            <w:shd w:fill="F4F9F9"/>
-          </w:tcPr>
-          <w:p>
-            <w:r>
-              <w:rPr>
-                <w:b/>
-                <w:sz w:val="18"/>
-              </w:rPr>
-              <w:t>DELETE</w:t>
-            </w:r>
-          </w:p>
-        </w:tc>
-        <w:tc>
-          <w:tcPr>
-            <w:tcW w:type="dxa" w:w="2592"/>
-            <w:tcMar>
-              <w:top w:w="100" w:type="dxa"/>
-              <w:bottom w:w="100" w:type="dxa"/>
-              <w:left w:w="150" w:type="dxa"/>
-              <w:right w:w="150" w:type="dxa"/>
-            </w:tcMar>
-            <w:shd w:fill="F4F9F9"/>
-          </w:tcPr>
-          <w:p>
-            <w:r>
-              <w:rPr>
-                <w:sz w:val="18"/>
-              </w:rPr>
-              <w:t>protect, isAdmin</w:t>
-            </w:r>
-          </w:p>
-        </w:tc>
-        <w:tc>
-          <w:tcPr>
-            <w:tcW w:type="dxa" w:w="3168"/>
-            <w:tcMar>
-              <w:top w:w="100" w:type="dxa"/>
-              <w:bottom w:w="100" w:type="dxa"/>
-              <w:left w:w="150" w:type="dxa"/>
-              <w:right w:w="150" w:type="dxa"/>
-            </w:tcMar>
-            <w:shd w:fill="F4F9F9"/>
-          </w:tcPr>
-          <w:p>
-            <w:r>
-              <w:rPr>
-                <w:sz w:val="18"/>
-              </w:rPr>
-              <w:t>Soft-delete a medicine (sets isActive: false)</w:t>
-            </w:r>
-          </w:p>
-        </w:tc>
-      </w:tr>
-      <w:tr>
-        <w:tc>
-          <w:tcPr>
-            <w:tcW w:type="dxa" w:w="3168"/>
-            <w:tcMar>
-              <w:top w:w="100" w:type="dxa"/>
-              <w:bottom w:w="100" w:type="dxa"/>
-              <w:left w:w="150" w:type="dxa"/>
-              <w:right w:w="150" w:type="dxa"/>
-            </w:tcMar>
-          </w:tcPr>
-          <w:p>
-            <w:r>
-              <w:rPr>
-                <w:rFonts w:ascii="Consolas" w:hAnsi="Consolas"/>
-                <w:b/>
-                <w:sz w:val="17"/>
-              </w:rPr>
-              <w:t>/api/admin/blogs</w:t>
-            </w:r>
-          </w:p>
-        </w:tc>
-        <w:tc>
-          <w:tcPr>
-            <w:tcW w:type="dxa" w:w="1152"/>
-            <w:tcMar>
-              <w:top w:w="100" w:type="dxa"/>
-              <w:bottom w:w="100" w:type="dxa"/>
-              <w:left w:w="150" w:type="dxa"/>
-              <w:right w:w="150" w:type="dxa"/>
-            </w:tcMar>
-          </w:tcPr>
-          <w:p>
-            <w:r>
-              <w:rPr>
-                <w:b/>
-                <w:sz w:val="18"/>
-              </w:rPr>
-              <w:t>POST</w:t>
-            </w:r>
-          </w:p>
-        </w:tc>
-        <w:tc>
-          <w:tcPr>
-            <w:tcW w:type="dxa" w:w="2592"/>
-            <w:tcMar>
-              <w:top w:w="100" w:type="dxa"/>
-              <w:bottom w:w="100" w:type="dxa"/>
-              <w:left w:w="150" w:type="dxa"/>
-              <w:right w:w="150" w:type="dxa"/>
-            </w:tcMar>
-          </w:tcPr>
-          <w:p>
-            <w:r>
-              <w:rPr>
-                <w:sz w:val="18"/>
-              </w:rPr>
-              <w:t>protect, isAdmin</w:t>
-            </w:r>
-          </w:p>
-        </w:tc>
-        <w:tc>
-          <w:tcPr>
-            <w:tcW w:type="dxa" w:w="3168"/>
-            <w:tcMar>
-              <w:top w:w="100" w:type="dxa"/>
-              <w:bottom w:w="100" w:type="dxa"/>
-              <w:left w:w="150" w:type="dxa"/>
-              <w:right w:w="150" w:type="dxa"/>
-            </w:tcMar>
-          </w:tcPr>
-          <w:p>
-            <w:r>
-              <w:rPr>
-                <w:sz w:val="18"/>
-              </w:rPr>
-              <w:t>Create a new blog post</w:t>
-            </w:r>
-          </w:p>
-        </w:tc>
-      </w:tr>
-      <w:tr>
-        <w:tc>
-          <w:tcPr>
-            <w:tcW w:type="dxa" w:w="3168"/>
-            <w:tcMar>
-              <w:top w:w="100" w:type="dxa"/>
-              <w:bottom w:w="100" w:type="dxa"/>
-              <w:left w:w="150" w:type="dxa"/>
-              <w:right w:w="150" w:type="dxa"/>
-            </w:tcMar>
-            <w:shd w:fill="F4F9F9"/>
-          </w:tcPr>
-          <w:p>
-            <w:r>
-              <w:rPr>
-                <w:rFonts w:ascii="Consolas" w:hAnsi="Consolas"/>
-                <w:b/>
-                <w:sz w:val="17"/>
-              </w:rPr>
-              <w:t>/api/admin/blogs/:id</w:t>
-            </w:r>
-          </w:p>
-        </w:tc>
-        <w:tc>
-          <w:tcPr>
-            <w:tcW w:type="dxa" w:w="1152"/>
-            <w:tcMar>
-              <w:top w:w="100" w:type="dxa"/>
-              <w:bottom w:w="100" w:type="dxa"/>
-              <w:left w:w="150" w:type="dxa"/>
-              <w:right w:w="150" w:type="dxa"/>
-            </w:tcMar>
-            <w:shd w:fill="F4F9F9"/>
-          </w:tcPr>
-          <w:p>
-            <w:r>
-              <w:rPr>
-                <w:b/>
-                <w:sz w:val="18"/>
-              </w:rPr>
-              <w:t>PUT</w:t>
-            </w:r>
-          </w:p>
-        </w:tc>
-        <w:tc>
-          <w:tcPr>
-            <w:tcW w:type="dxa" w:w="2592"/>
-            <w:tcMar>
-              <w:top w:w="100" w:type="dxa"/>
-              <w:bottom w:w="100" w:type="dxa"/>
-              <w:left w:w="150" w:type="dxa"/>
-              <w:right w:w="150" w:type="dxa"/>
-            </w:tcMar>
-            <w:shd w:fill="F4F9F9"/>
-          </w:tcPr>
-          <w:p>
-            <w:r>
-              <w:rPr>
-                <w:sz w:val="18"/>
-              </w:rPr>
-              <w:t>protect, isAdmin</w:t>
-            </w:r>
-          </w:p>
-        </w:tc>
-        <w:tc>
-          <w:tcPr>
-            <w:tcW w:type="dxa" w:w="3168"/>
-            <w:tcMar>
-              <w:top w:w="100" w:type="dxa"/>
-              <w:bottom w:w="100" w:type="dxa"/>
-              <w:left w:w="150" w:type="dxa"/>
-              <w:right w:w="150" w:type="dxa"/>
-            </w:tcMar>
-            <w:shd w:fill="F4F9F9"/>
-          </w:tcPr>
-          <w:p>
-            <w:r>
-              <w:rPr>
-                <w:sz w:val="18"/>
-              </w:rPr>
-              <w:t>Update a blog post details &amp; slug</w:t>
-            </w:r>
-          </w:p>
-        </w:tc>
-      </w:tr>
-      <w:tr>
-        <w:tc>
-          <w:tcPr>
-            <w:tcW w:type="dxa" w:w="3168"/>
-            <w:tcMar>
-              <w:top w:w="100" w:type="dxa"/>
-              <w:bottom w:w="100" w:type="dxa"/>
-              <w:left w:w="150" w:type="dxa"/>
-              <w:right w:w="150" w:type="dxa"/>
-            </w:tcMar>
-          </w:tcPr>
-          <w:p>
-            <w:r>
-              <w:rPr>
-                <w:rFonts w:ascii="Consolas" w:hAnsi="Consolas"/>
-                <w:b/>
-                <w:sz w:val="17"/>
-              </w:rPr>
-              <w:t>/api/admin/blogs/:id</w:t>
-            </w:r>
-          </w:p>
-        </w:tc>
-        <w:tc>
-          <w:tcPr>
-            <w:tcW w:type="dxa" w:w="1152"/>
-            <w:tcMar>
-              <w:top w:w="100" w:type="dxa"/>
-              <w:bottom w:w="100" w:type="dxa"/>
-              <w:left w:w="150" w:type="dxa"/>
-              <w:right w:w="150" w:type="dxa"/>
-            </w:tcMar>
-          </w:tcPr>
-          <w:p>
-            <w:r>
-              <w:rPr>
-                <w:b/>
-                <w:sz w:val="18"/>
-              </w:rPr>
-              <w:t>DELETE</w:t>
-            </w:r>
-          </w:p>
-        </w:tc>
-        <w:tc>
-          <w:tcPr>
-            <w:tcW w:type="dxa" w:w="2592"/>
-            <w:tcMar>
-              <w:top w:w="100" w:type="dxa"/>
-              <w:bottom w:w="100" w:type="dxa"/>
-              <w:left w:w="150" w:type="dxa"/>
-              <w:right w:w="150" w:type="dxa"/>
-            </w:tcMar>
-          </w:tcPr>
-          <w:p>
-            <w:r>
-              <w:rPr>
-                <w:sz w:val="18"/>
-              </w:rPr>
-              <w:t>protect, isAdmin</w:t>
-            </w:r>
-          </w:p>
-        </w:tc>
-        <w:tc>
-          <w:tcPr>
-            <w:tcW w:type="dxa" w:w="3168"/>
-            <w:tcMar>
-              <w:top w:w="100" w:type="dxa"/>
-              <w:bottom w:w="100" w:type="dxa"/>
-              <w:left w:w="150" w:type="dxa"/>
-              <w:right w:w="150" w:type="dxa"/>
-            </w:tcMar>
-          </w:tcPr>
-          <w:p>
-            <w:r>
-              <w:rPr>
-                <w:sz w:val="18"/>
-              </w:rPr>
-              <w:t>Soft-delete a blog post (sets status: 'draft')</w:t>
-            </w:r>
-          </w:p>
-        </w:tc>
-      </w:tr>
-      <w:tr>
-        <w:tc>
-          <w:tcPr>
-            <w:tcW w:type="dxa" w:w="3168"/>
-            <w:tcMar>
-              <w:top w:w="100" w:type="dxa"/>
-              <w:bottom w:w="100" w:type="dxa"/>
-              <w:left w:w="150" w:type="dxa"/>
-              <w:right w:w="150" w:type="dxa"/>
-            </w:tcMar>
-            <w:shd w:fill="F4F9F9"/>
-          </w:tcPr>
-          <w:p>
-            <w:r>
-              <w:rPr>
-                <w:rFonts w:ascii="Consolas" w:hAnsi="Consolas"/>
-                <w:b/>
-                <w:sz w:val="17"/>
-              </w:rPr>
-              <w:t>/api/admin/appointments/:id/status</w:t>
-            </w:r>
-          </w:p>
-        </w:tc>
-        <w:tc>
-          <w:tcPr>
-            <w:tcW w:type="dxa" w:w="1152"/>
-            <w:tcMar>
-              <w:top w:w="100" w:type="dxa"/>
-              <w:bottom w:w="100" w:type="dxa"/>
-              <w:left w:w="150" w:type="dxa"/>
-              <w:right w:w="150" w:type="dxa"/>
-            </w:tcMar>
-            <w:shd w:fill="F4F9F9"/>
-          </w:tcPr>
-          <w:p>
-            <w:r>
-              <w:rPr>
-                <w:b/>
-                <w:sz w:val="18"/>
-              </w:rPr>
-              <w:t>PATCH</w:t>
-            </w:r>
-          </w:p>
-        </w:tc>
-        <w:tc>
-          <w:tcPr>
-            <w:tcW w:type="dxa" w:w="2592"/>
-            <w:tcMar>
-              <w:top w:w="100" w:type="dxa"/>
-              <w:bottom w:w="100" w:type="dxa"/>
-              <w:left w:w="150" w:type="dxa"/>
-              <w:right w:w="150" w:type="dxa"/>
-            </w:tcMar>
-            <w:shd w:fill="F4F9F9"/>
-          </w:tcPr>
-          <w:p>
-            <w:r>
-              <w:rPr>
-                <w:sz w:val="18"/>
-              </w:rPr>
-              <w:t>protect, isAdmin</w:t>
-            </w:r>
-          </w:p>
-        </w:tc>
-        <w:tc>
-          <w:tcPr>
-            <w:tcW w:type="dxa" w:w="3168"/>
-            <w:tcMar>
-              <w:top w:w="100" w:type="dxa"/>
-              <w:bottom w:w="100" w:type="dxa"/>
-              <w:left w:w="150" w:type="dxa"/>
-              <w:right w:w="150" w:type="dxa"/>
-            </w:tcMar>
-            <w:shd w:fill="F4F9F9"/>
-          </w:tcPr>
-          <w:p>
-            <w:r>
-              <w:rPr>
-                <w:sz w:val="18"/>
-              </w:rPr>
-              <w:t>Update appointment status</w:t>
-            </w:r>
-          </w:p>
-        </w:tc>
-      </w:tr>
-      <w:tr>
-        <w:tc>
-          <w:tcPr>
-            <w:tcW w:type="dxa" w:w="3168"/>
-            <w:tcMar>
-              <w:top w:w="100" w:type="dxa"/>
-              <w:bottom w:w="100" w:type="dxa"/>
-              <w:left w:w="150" w:type="dxa"/>
-              <w:right w:w="150" w:type="dxa"/>
-            </w:tcMar>
-          </w:tcPr>
-          <w:p>
-            <w:r>
-              <w:rPr>
-                <w:rFonts w:ascii="Consolas" w:hAnsi="Consolas"/>
-                <w:b/>
-                <w:sz w:val="17"/>
-              </w:rPr>
-              <w:t>/api/admin/orders/:id/status</w:t>
-            </w:r>
-          </w:p>
-        </w:tc>
-        <w:tc>
-          <w:tcPr>
-            <w:tcW w:type="dxa" w:w="1152"/>
-            <w:tcMar>
-              <w:top w:w="100" w:type="dxa"/>
-              <w:bottom w:w="100" w:type="dxa"/>
-              <w:left w:w="150" w:type="dxa"/>
-              <w:right w:w="150" w:type="dxa"/>
-            </w:tcMar>
-          </w:tcPr>
-          <w:p>
-            <w:r>
-              <w:rPr>
-                <w:b/>
-                <w:sz w:val="18"/>
-              </w:rPr>
-              <w:t>PATCH</w:t>
-            </w:r>
-          </w:p>
-        </w:tc>
-        <w:tc>
-          <w:tcPr>
-            <w:tcW w:type="dxa" w:w="2592"/>
-            <w:tcMar>
-              <w:top w:w="100" w:type="dxa"/>
-              <w:bottom w:w="100" w:type="dxa"/>
-              <w:left w:w="150" w:type="dxa"/>
-              <w:right w:w="150" w:type="dxa"/>
-            </w:tcMar>
-          </w:tcPr>
-          <w:p>
-            <w:r>
-              <w:rPr>
-                <w:sz w:val="18"/>
-              </w:rPr>
-              <w:t>protect, isAdmin</w:t>
-            </w:r>
-          </w:p>
-        </w:tc>
-        <w:tc>
-          <w:tcPr>
-            <w:tcW w:type="dxa" w:w="3168"/>
-            <w:tcMar>
-              <w:top w:w="100" w:type="dxa"/>
-              <w:bottom w:w="100" w:type="dxa"/>
-              <w:left w:w="150" w:type="dxa"/>
-              <w:right w:w="150" w:type="dxa"/>
-            </w:tcMar>
-          </w:tcPr>
-          <w:p>
-            <w:r>
-              <w:rPr>
-                <w:sz w:val="18"/>
-              </w:rPr>
-              <w:t>Update medicine order status</w:t>
-            </w:r>
-          </w:p>
-        </w:tc>
-      </w:tr>
-      <w:tr>
-        <w:tc>
-          <w:tcPr>
-            <w:tcW w:type="dxa" w:w="3168"/>
-            <w:tcMar>
-              <w:top w:w="100" w:type="dxa"/>
-              <w:bottom w:w="100" w:type="dxa"/>
-              <w:left w:w="150" w:type="dxa"/>
-              <w:right w:w="150" w:type="dxa"/>
-            </w:tcMar>
-            <w:shd w:fill="F4F9F9"/>
-          </w:tcPr>
-          <w:p>
-            <w:r>
-              <w:rPr>
-                <w:rFonts w:ascii="Consolas" w:hAnsi="Consolas"/>
-                <w:b/>
-                <w:sz w:val="17"/>
-              </w:rPr>
-              <w:t>/api/admin/lab-bookings/:id/status</w:t>
-            </w:r>
-          </w:p>
-        </w:tc>
-        <w:tc>
-          <w:tcPr>
-            <w:tcW w:type="dxa" w:w="1152"/>
-            <w:tcMar>
-              <w:top w:w="100" w:type="dxa"/>
-              <w:bottom w:w="100" w:type="dxa"/>
-              <w:left w:w="150" w:type="dxa"/>
-              <w:right w:w="150" w:type="dxa"/>
-            </w:tcMar>
-            <w:shd w:fill="F4F9F9"/>
-          </w:tcPr>
-          <w:p>
-            <w:r>
-              <w:rPr>
-                <w:b/>
-                <w:sz w:val="18"/>
-              </w:rPr>
-              <w:t>PATCH</w:t>
-            </w:r>
-          </w:p>
-        </w:tc>
-        <w:tc>
-          <w:tcPr>
-            <w:tcW w:type="dxa" w:w="2592"/>
-            <w:tcMar>
-              <w:top w:w="100" w:type="dxa"/>
-              <w:bottom w:w="100" w:type="dxa"/>
-              <w:left w:w="150" w:type="dxa"/>
-              <w:right w:w="150" w:type="dxa"/>
-            </w:tcMar>
-            <w:shd w:fill="F4F9F9"/>
-          </w:tcPr>
-          <w:p>
-            <w:r>
-              <w:rPr>
-                <w:sz w:val="18"/>
-              </w:rPr>
-              <w:t>protect, isAdmin</w:t>
-            </w:r>
-          </w:p>
-        </w:tc>
-        <w:tc>
-          <w:tcPr>
-            <w:tcW w:type="dxa" w:w="3168"/>
-            <w:tcMar>
-              <w:top w:w="100" w:type="dxa"/>
-              <w:bottom w:w="100" w:type="dxa"/>
-              <w:left w:w="150" w:type="dxa"/>
-              <w:right w:w="150" w:type="dxa"/>
-            </w:tcMar>
-            <w:shd w:fill="F4F9F9"/>
-          </w:tcPr>
-          <w:p>
-            <w:r>
-              <w:rPr>
-                <w:sz w:val="18"/>
-              </w:rPr>
-              <w:t>Update lab test booking status</w:t>
-            </w:r>
-          </w:p>
-        </w:tc>
-      </w:tr>
-      <w:tr>
-        <w:tc>
-          <w:tcPr>
-            <w:tcW w:type="dxa" w:w="3168"/>
-            <w:tcMar>
-              <w:top w:w="100" w:type="dxa"/>
-              <w:bottom w:w="100" w:type="dxa"/>
-              <w:left w:w="150" w:type="dxa"/>
-              <w:right w:w="150" w:type="dxa"/>
-            </w:tcMar>
-          </w:tcPr>
-          <w:p>
-            <w:r>
-              <w:rPr>
-                <w:rFonts w:ascii="Consolas" w:hAnsi="Consolas"/>
-                <w:b/>
-                <w:sz w:val="17"/>
-              </w:rPr>
-              <w:t>/api/admin/messages</w:t>
-            </w:r>
-          </w:p>
-        </w:tc>
-        <w:tc>
-          <w:tcPr>
-            <w:tcW w:type="dxa" w:w="1152"/>
-            <w:tcMar>
-              <w:top w:w="100" w:type="dxa"/>
-              <w:bottom w:w="100" w:type="dxa"/>
-              <w:left w:w="150" w:type="dxa"/>
-              <w:right w:w="150" w:type="dxa"/>
-            </w:tcMar>
-          </w:tcPr>
-          <w:p>
-            <w:r>
-              <w:rPr>
-                <w:b/>
-                <w:sz w:val="18"/>
-              </w:rPr>
-              <w:t>GET</w:t>
-            </w:r>
-          </w:p>
-        </w:tc>
-        <w:tc>
-          <w:tcPr>
-            <w:tcW w:type="dxa" w:w="2592"/>
-            <w:tcMar>
-              <w:top w:w="100" w:type="dxa"/>
-              <w:bottom w:w="100" w:type="dxa"/>
-              <w:left w:w="150" w:type="dxa"/>
-              <w:right w:w="150" w:type="dxa"/>
-            </w:tcMar>
-          </w:tcPr>
-          <w:p>
-            <w:r>
-              <w:rPr>
-                <w:sz w:val="18"/>
-              </w:rPr>
-              <w:t>protect, isAdmin</w:t>
-            </w:r>
-          </w:p>
-        </w:tc>
-        <w:tc>
-          <w:tcPr>
-            <w:tcW w:type="dxa" w:w="3168"/>
-            <w:tcMar>
-              <w:top w:w="100" w:type="dxa"/>
-              <w:bottom w:w="100" w:type="dxa"/>
-              <w:left w:w="150" w:type="dxa"/>
-              <w:right w:w="150" w:type="dxa"/>
-            </w:tcMar>
-          </w:tcPr>
-          <w:p>
-            <w:r>
-              <w:rPr>
-                <w:sz w:val="18"/>
-              </w:rPr>
-              <w:t>Get paginated customer inquiries</w:t>
-            </w:r>
-          </w:p>
-        </w:tc>
-      </w:tr>
-    </w:tbl>
     <w:p>
       <w:pPr>
-        <w:spacing w:before="240"/>
+        <w:keepNext/>
+        <w:spacing w:before="240" w:after="120"/>
+      </w:pPr>
+      <w:r>
+        <w:rPr>
+          <w:b/>
+          <w:color w:val="2E75B6"/>
+          <w:sz w:val="24"/>
+        </w:rPr>
+        <w:t>A. Administrative Dashboard</w:t>
+      </w:r>
+    </w:p>
+    <w:p>
+      <w:r>
+        <w:t>Displays KPI metrics counters, Recharts weekly clinics activity logs, and unread patient support message cards.</w:t>
+      </w:r>
+    </w:p>
+    <w:p>
+      <w:r>
+        <w:drawing>
+          <wp:inline xmlns:a="http://schemas.openxmlformats.org/drawingml/2006/main" xmlns:pic="http://schemas.openxmlformats.org/drawingml/2006/picture">
+            <wp:extent cx="5486400" cy="2700338"/>
+            <wp:docPr id="1" name="Picture 1"/>
+            <wp:cNvGraphicFramePr>
+              <a:graphicFrameLocks noChangeAspect="1"/>
+            </wp:cNvGraphicFramePr>
+            <a:graphic>
+              <a:graphicData uri="http://schemas.openxmlformats.org/drawingml/2006/picture">
+                <pic:pic>
+                  <pic:nvPicPr>
+                    <pic:cNvPr id="0" name="admin_dashboard_1783353749922.png"/>
+                    <pic:cNvPicPr/>
+                  </pic:nvPicPr>
+                  <pic:blipFill>
+                    <a:blip r:embed="rId9"/>
+                    <a:stretch>
+                      <a:fillRect/>
+                    </a:stretch>
+                  </pic:blipFill>
+                  <pic:spPr>
+                    <a:xfrm>
+                      <a:off x="0" y="0"/>
+                      <a:ext cx="5486400" cy="2700338"/>
+                    </a:xfrm>
+                    <a:prstGeom prst="rect"/>
+                  </pic:spPr>
+                </pic:pic>
+              </a:graphicData>
+            </a:graphic>
+          </wp:inline>
+        </w:drawing>
+      </w:r>
+    </w:p>
+    <w:p>
+      <w:pPr>
+        <w:spacing w:before="120"/>
+      </w:pPr>
+    </w:p>
+    <w:p>
+      <w:pPr>
+        <w:keepNext/>
+        <w:spacing w:before="240" w:after="120"/>
+      </w:pPr>
+      <w:r>
+        <w:rPr>
+          <w:b/>
+          <w:color w:val="2E75B6"/>
+          <w:sz w:val="24"/>
+        </w:rPr>
+        <w:t>B. Doctors Management</w:t>
+      </w:r>
+    </w:p>
+    <w:p>
+      <w:r>
+        <w:t>Loads all seeded doctor profiles from the database, displaying specialty qualifications, schedules, and active switches.</w:t>
+      </w:r>
+    </w:p>
+    <w:p>
+      <w:r>
+        <w:drawing>
+          <wp:inline xmlns:a="http://schemas.openxmlformats.org/drawingml/2006/main" xmlns:pic="http://schemas.openxmlformats.org/drawingml/2006/picture">
+            <wp:extent cx="5486400" cy="2700338"/>
+            <wp:docPr id="2" name="Picture 2"/>
+            <wp:cNvGraphicFramePr>
+              <a:graphicFrameLocks noChangeAspect="1"/>
+            </wp:cNvGraphicFramePr>
+            <a:graphic>
+              <a:graphicData uri="http://schemas.openxmlformats.org/drawingml/2006/picture">
+                <pic:pic>
+                  <pic:nvPicPr>
+                    <pic:cNvPr id="0" name="manage_doctors_seeded_1783355016759.png"/>
+                    <pic:cNvPicPr/>
+                  </pic:nvPicPr>
+                  <pic:blipFill>
+                    <a:blip r:embed="rId10"/>
+                    <a:stretch>
+                      <a:fillRect/>
+                    </a:stretch>
+                  </pic:blipFill>
+                  <pic:spPr>
+                    <a:xfrm>
+                      <a:off x="0" y="0"/>
+                      <a:ext cx="5486400" cy="2700338"/>
+                    </a:xfrm>
+                    <a:prstGeom prst="rect"/>
+                  </pic:spPr>
+                </pic:pic>
+              </a:graphicData>
+            </a:graphic>
+          </wp:inline>
+        </w:drawing>
+      </w:r>
+    </w:p>
+    <w:p>
+      <w:pPr>
+        <w:spacing w:before="120"/>
+      </w:pPr>
+    </w:p>
+    <w:p>
+      <w:pPr>
+        <w:keepNext/>
+        <w:spacing w:before="240" w:after="120"/>
+      </w:pPr>
+      <w:r>
+        <w:rPr>
+          <w:b/>
+          <w:color w:val="2E75B6"/>
+          <w:sz w:val="24"/>
+        </w:rPr>
+        <w:t>C. Pharmacy Catalog Manager</w:t>
+      </w:r>
+    </w:p>
+    <w:p>
+      <w:r>
+        <w:t>Lists stock inventory alerts (low stock warning badges), prices, prescription requirements, and toggles.</w:t>
+      </w:r>
+    </w:p>
+    <w:p>
+      <w:r>
+        <w:drawing>
+          <wp:inline xmlns:a="http://schemas.openxmlformats.org/drawingml/2006/main" xmlns:pic="http://schemas.openxmlformats.org/drawingml/2006/picture">
+            <wp:extent cx="5486400" cy="2700338"/>
+            <wp:docPr id="3" name="Picture 3"/>
+            <wp:cNvGraphicFramePr>
+              <a:graphicFrameLocks noChangeAspect="1"/>
+            </wp:cNvGraphicFramePr>
+            <a:graphic>
+              <a:graphicData uri="http://schemas.openxmlformats.org/drawingml/2006/picture">
+                <pic:pic>
+                  <pic:nvPicPr>
+                    <pic:cNvPr id="0" name="manage_medicines_seeded_1783355046947.png"/>
+                    <pic:cNvPicPr/>
+                  </pic:nvPicPr>
+                  <pic:blipFill>
+                    <a:blip r:embed="rId11"/>
+                    <a:stretch>
+                      <a:fillRect/>
+                    </a:stretch>
+                  </pic:blipFill>
+                  <pic:spPr>
+                    <a:xfrm>
+                      <a:off x="0" y="0"/>
+                      <a:ext cx="5486400" cy="2700338"/>
+                    </a:xfrm>
+                    <a:prstGeom prst="rect"/>
+                  </pic:spPr>
+                </pic:pic>
+              </a:graphicData>
+            </a:graphic>
+          </wp:inline>
+        </w:drawing>
+      </w:r>
+    </w:p>
+    <w:p>
+      <w:pPr>
+        <w:spacing w:before="120"/>
+      </w:pPr>
+    </w:p>
+    <w:p>
+      <w:pPr>
+        <w:keepNext/>
+        <w:spacing w:before="240" w:after="120"/>
+      </w:pPr>
+      <w:r>
+        <w:rPr>
+          <w:b/>
+          <w:color w:val="2E75B6"/>
+          <w:sz w:val="24"/>
+        </w:rPr>
+        <w:t>D. Appointments Tracker</w:t>
+      </w:r>
+    </w:p>
+    <w:p>
+      <w:r>
+        <w:t>Monitors patient time slots, doctor allocations, checkup dates, and transitions appointment states.</w:t>
+      </w:r>
+    </w:p>
+    <w:p>
+      <w:r>
+        <w:drawing>
+          <wp:inline xmlns:a="http://schemas.openxmlformats.org/drawingml/2006/main" xmlns:pic="http://schemas.openxmlformats.org/drawingml/2006/picture">
+            <wp:extent cx="5486400" cy="2700338"/>
+            <wp:docPr id="4" name="Picture 4"/>
+            <wp:cNvGraphicFramePr>
+              <a:graphicFrameLocks noChangeAspect="1"/>
+            </wp:cNvGraphicFramePr>
+            <a:graphic>
+              <a:graphicData uri="http://schemas.openxmlformats.org/drawingml/2006/picture">
+                <pic:pic>
+                  <pic:nvPicPr>
+                    <pic:cNvPr id="0" name="manage_appointments_seeded_1783355101414.png"/>
+                    <pic:cNvPicPr/>
+                  </pic:nvPicPr>
+                  <pic:blipFill>
+                    <a:blip r:embed="rId12"/>
+                    <a:stretch>
+                      <a:fillRect/>
+                    </a:stretch>
+                  </pic:blipFill>
+                  <pic:spPr>
+                    <a:xfrm>
+                      <a:off x="0" y="0"/>
+                      <a:ext cx="5486400" cy="2700338"/>
+                    </a:xfrm>
+                    <a:prstGeom prst="rect"/>
+                  </pic:spPr>
+                </pic:pic>
+              </a:graphicData>
+            </a:graphic>
+          </wp:inline>
+        </w:drawing>
+      </w:r>
+    </w:p>
+    <w:p>
+      <w:pPr>
+        <w:spacing w:before="120"/>
+      </w:pPr>
+    </w:p>
+    <w:p>
+      <w:pPr>
+        <w:keepNext/>
+        <w:spacing w:before="240" w:after="120"/>
+      </w:pPr>
+      <w:r>
+        <w:rPr>
+          <w:b/>
+          <w:color w:val="2E75B6"/>
+          <w:sz w:val="24"/>
+        </w:rPr>
+        <w:t>E. Pharmacy Orders dashboard</w:t>
+      </w:r>
+    </w:p>
+    <w:p>
+      <w:r>
+        <w:t>Displays recipient invoices and coordinates delivery shipping states.</w:t>
+      </w:r>
+    </w:p>
+    <w:p>
+      <w:r>
+        <w:drawing>
+          <wp:inline xmlns:a="http://schemas.openxmlformats.org/drawingml/2006/main" xmlns:pic="http://schemas.openxmlformats.org/drawingml/2006/picture">
+            <wp:extent cx="5486400" cy="2700338"/>
+            <wp:docPr id="5" name="Picture 5"/>
+            <wp:cNvGraphicFramePr>
+              <a:graphicFrameLocks noChangeAspect="1"/>
+            </wp:cNvGraphicFramePr>
+            <a:graphic>
+              <a:graphicData uri="http://schemas.openxmlformats.org/drawingml/2006/picture">
+                <pic:pic>
+                  <pic:nvPicPr>
+                    <pic:cNvPr id="0" name="manage_orders_seeded_1783355125398.png"/>
+                    <pic:cNvPicPr/>
+                  </pic:nvPicPr>
+                  <pic:blipFill>
+                    <a:blip r:embed="rId13"/>
+                    <a:stretch>
+                      <a:fillRect/>
+                    </a:stretch>
+                  </pic:blipFill>
+                  <pic:spPr>
+                    <a:xfrm>
+                      <a:off x="0" y="0"/>
+                      <a:ext cx="5486400" cy="2700338"/>
+                    </a:xfrm>
+                    <a:prstGeom prst="rect"/>
+                  </pic:spPr>
+                </pic:pic>
+              </a:graphicData>
+            </a:graphic>
+          </wp:inline>
+        </w:drawing>
+      </w:r>
+    </w:p>
+    <w:p>
+      <w:pPr>
+        <w:spacing w:before="120"/>
+      </w:pPr>
+    </w:p>
+    <w:p>
+      <w:pPr>
+        <w:keepNext/>
+        <w:spacing w:before="240" w:after="120"/>
+      </w:pPr>
+      <w:r>
+        <w:rPr>
+          <w:b/>
+          <w:color w:val="2E75B6"/>
+          <w:sz w:val="24"/>
+        </w:rPr>
+        <w:t>F. Customer Support Inbox</w:t>
+      </w:r>
+    </w:p>
+    <w:p>
+      <w:r>
+        <w:t>Lists patient inquiries with read/unread status filtering support and review triggers.</w:t>
+      </w:r>
+    </w:p>
+    <w:p>
+      <w:r>
+        <w:drawing>
+          <wp:inline xmlns:a="http://schemas.openxmlformats.org/drawingml/2006/main" xmlns:pic="http://schemas.openxmlformats.org/drawingml/2006/picture">
+            <wp:extent cx="5486400" cy="2700338"/>
+            <wp:docPr id="6" name="Picture 6"/>
+            <wp:cNvGraphicFramePr>
+              <a:graphicFrameLocks noChangeAspect="1"/>
+            </wp:cNvGraphicFramePr>
+            <a:graphic>
+              <a:graphicData uri="http://schemas.openxmlformats.org/drawingml/2006/picture">
+                <pic:pic>
+                  <pic:nvPicPr>
+                    <pic:cNvPr id="0" name="inquiries_messages_seeded_1783355074485.png"/>
+                    <pic:cNvPicPr/>
+                  </pic:nvPicPr>
+                  <pic:blipFill>
+                    <a:blip r:embed="rId14"/>
+                    <a:stretch>
+                      <a:fillRect/>
+                    </a:stretch>
+                  </pic:blipFill>
+                  <pic:spPr>
+                    <a:xfrm>
+                      <a:off x="0" y="0"/>
+                      <a:ext cx="5486400" cy="2700338"/>
+                    </a:xfrm>
+                    <a:prstGeom prst="rect"/>
+                  </pic:spPr>
+                </pic:pic>
+              </a:graphicData>
+            </a:graphic>
+          </wp:inline>
+        </w:drawing>
+      </w:r>
+    </w:p>
+    <w:p>
+      <w:pPr>
+        <w:spacing w:before="120"/>
       </w:pPr>
     </w:p>
     <w:p>
@@ -1670,206 +637,18 @@
           <w:color w:val="0E7C86"/>
           <w:sz w:val="28"/>
         </w:rPr>
-        <w:t>4. Local Execution Logs</w:t>
+        <w:t>4. Next Objective</w:t>
       </w:r>
     </w:p>
     <w:p>
-      <w:pPr>
-        <w:keepNext/>
-        <w:spacing w:before="240" w:after="120"/>
-      </w:pPr>
       <w:r>
-        <w:rPr>
-          <w:b/>
-          <w:color w:val="2E75B6"/>
-          <w:sz w:val="24"/>
-        </w:rPr>
-        <w:t>A. Database Seeding Trace</w:t>
-      </w:r>
-    </w:p>
-    <w:tbl>
-      <w:tblPr>
-        <w:tblW w:type="auto" w:w="0"/>
-        <w:tblLook w:firstColumn="1" w:firstRow="1" w:lastColumn="0" w:lastRow="0" w:noHBand="0" w:noVBand="1" w:val="04A0"/>
-      </w:tblPr>
-      <w:tblGrid>
-        <w:gridCol w:w="9360"/>
-      </w:tblGrid>
-      <w:tr>
-        <w:tc>
-          <w:tcPr>
-            <w:tcW w:type="dxa" w:w="9360"/>
-            <w:shd w:fill="F4F9F9"/>
-            <w:tcMar>
-              <w:top w:w="100" w:type="dxa"/>
-              <w:bottom w:w="100" w:type="dxa"/>
-              <w:left w:w="150" w:type="dxa"/>
-              <w:right w:w="150" w:type="dxa"/>
-            </w:tcMar>
-          </w:tcPr>
-          <w:p>
-            <w:pPr>
-              <w:spacing w:line="276" w:lineRule="auto"/>
-            </w:pPr>
-            <w:r>
-              <w:rPr>
-                <w:rFonts w:ascii="Consolas" w:hAnsi="Consolas"/>
-                <w:color w:val="3C3C3C"/>
-                <w:sz w:val="17"/>
-              </w:rPr>
-              <w:t>MongoDB Connected: 127.0.0.1</w:t>
-              <w:br/>
-              <w:t>Clearing existing database collections...</w:t>
-              <w:br/>
-              <w:t>Database cleared.</w:t>
-              <w:br/>
-              <w:t>Seeding Users...</w:t>
-              <w:br/>
-              <w:t>Seeded 2 users successfully.</w:t>
-              <w:br/>
-              <w:t>Seeding Doctors...</w:t>
-              <w:br/>
-              <w:t>Seeded 5 doctors successfully.</w:t>
-              <w:br/>
-              <w:t>Seeding Medicines...</w:t>
-              <w:br/>
-              <w:t>Seeded 8 medicines successfully.</w:t>
-              <w:br/>
-              <w:t>Seeding Blogs...</w:t>
-              <w:br/>
-              <w:t>Seeded 4 blogs successfully.</w:t>
-              <w:br/>
-              <w:t>Seeding Emergency Contacts...</w:t>
-              <w:br/>
-              <w:t>Seeded 8 emergency contacts successfully.</w:t>
-              <w:br/>
-              <w:t>Seeding Lab Tests...</w:t>
-              <w:br/>
-              <w:t>Seeded 4 lab tests successfully.</w:t>
-              <w:br/>
-              <w:t>Seeding Mock Appointments...</w:t>
-              <w:br/>
-              <w:t>Seeded 1 mock appointment.</w:t>
-              <w:br/>
-              <w:t>Seeding Mock Orders...</w:t>
-              <w:br/>
-              <w:t>Seeded 1 mock order.</w:t>
-              <w:br/>
-              <w:t>Seeding Mock Lab Bookings...</w:t>
-              <w:br/>
-              <w:t>Seeded 1 mock lab booking.</w:t>
-              <w:br/>
-              <w:t>Seeding Mock Contact Messages...</w:t>
-              <w:br/>
-              <w:t>Seeded 1 mock contact message.</w:t>
-              <w:br/>
-              <w:t>Database seeding completed successfully!</w:t>
-            </w:r>
-          </w:p>
-        </w:tc>
-      </w:tr>
-    </w:tbl>
-    <w:p>
-      <w:pPr>
-        <w:keepNext/>
-        <w:spacing w:before="240" w:after="120"/>
-      </w:pPr>
-      <w:r>
-        <w:rPr>
-          <w:b/>
-          <w:color w:val="2E75B6"/>
-          <w:sz w:val="24"/>
-        </w:rPr>
-        <w:t>B. Server Initialization Trace</w:t>
-      </w:r>
-    </w:p>
-    <w:tbl>
-      <w:tblPr>
-        <w:tblW w:type="auto" w:w="0"/>
-        <w:tblLook w:firstColumn="1" w:firstRow="1" w:lastColumn="0" w:lastRow="0" w:noHBand="0" w:noVBand="1" w:val="04A0"/>
-      </w:tblPr>
-      <w:tblGrid>
-        <w:gridCol w:w="9360"/>
-      </w:tblGrid>
-      <w:tr>
-        <w:tc>
-          <w:tcPr>
-            <w:tcW w:type="dxa" w:w="9360"/>
-            <w:shd w:fill="F4F9F9"/>
-            <w:tcMar>
-              <w:top w:w="100" w:type="dxa"/>
-              <w:bottom w:w="100" w:type="dxa"/>
-              <w:left w:w="150" w:type="dxa"/>
-              <w:right w:w="150" w:type="dxa"/>
-            </w:tcMar>
-          </w:tcPr>
-          <w:p>
-            <w:pPr>
-              <w:spacing w:line="276" w:lineRule="auto"/>
-            </w:pPr>
-            <w:r>
-              <w:rPr>
-                <w:rFonts w:ascii="Consolas" w:hAnsi="Consolas"/>
-                <w:color w:val="3C3C3C"/>
-                <w:sz w:val="17"/>
-              </w:rPr>
-              <w:t>🚀 Server running on http://localhost:5000</w:t>
-              <w:br/>
-              <w:t>✅ MongoDB Connected: 127.0.0.1</w:t>
-            </w:r>
-          </w:p>
-        </w:tc>
-      </w:tr>
-    </w:tbl>
-    <w:p>
-      <w:pPr>
-        <w:spacing w:before="240"/>
-      </w:pPr>
-    </w:p>
-    <w:p>
-      <w:pPr>
-        <w:keepNext/>
-        <w:spacing w:before="360" w:after="160"/>
-      </w:pPr>
-      <w:r>
-        <w:rPr>
-          <w:b/>
-          <w:color w:val="0E7C86"/>
-          <w:sz w:val="28"/>
-        </w:rPr>
-        <w:t>5. Next Objective</w:t>
-      </w:r>
-    </w:p>
-    <w:p>
-      <w:pPr>
-        <w:spacing w:after="80"/>
-      </w:pPr>
-      <w:r>
-        <w:t>All backend APIs and database elements are fully functional and synchronized. The next objective is Phase 3 (Admin Frontend Setup &amp; Layout):</w:t>
-      </w:r>
-    </w:p>
-    <w:p>
-      <w:pPr>
-        <w:pStyle w:val="ListBullet"/>
-      </w:pPr>
-      <w:r>
-        <w:t>Setting up route guards (AdminRoute.jsx) to filter admin access from patients.</w:t>
-      </w:r>
-    </w:p>
-    <w:p>
-      <w:pPr>
-        <w:pStyle w:val="ListBullet"/>
-      </w:pPr>
-      <w:r>
-        <w:t>Constructing the core AdminLayout.jsx with a responsive navigation sidebar.</w:t>
-      </w:r>
-    </w:p>
-    <w:p>
-      <w:pPr>
-        <w:pStyle w:val="ListBullet"/>
-      </w:pPr>
-      <w:r>
-        <w:t>Implementing the main Dashboard.jsx featuring clinical KPI widgets.</w:t>
+        <w:t>All five development phases have been successfully implemented and validated. The next objective is **Phase 6: QA Auditing &amp; Test Scenarios**:</w:t>
+        <w:br/>
+        <w:t>• Establish formal automated test scripts mapping API endpoint status changes.</w:t>
+        <w:br/>
+        <w:t>• Run regression suites across doctor/medicine deactivation checks.</w:t>
+        <w:br/>
+        <w:t>• Document boundary test results under extreme loads and database drops.</w:t>
       </w:r>
     </w:p>
     <w:sectPr>

</xml_diff>

<commit_message>
docs: compile and add Phase 6 progress report covering testing suite and validator refactoring
</commit_message>
<xml_diff>
--- a/docs/Progress_Report_Mohamed_Mostafa.docx
+++ b/docs/Progress_Report_Mohamed_Mostafa.docx
@@ -13,7 +13,7 @@
           <w:color w:val="0E7C86"/>
           <w:sz w:val="36"/>
         </w:rPr>
-        <w:t>Progress Report: Full Admin Panel Development (Phases 1 - 5)</w:t>
+        <w:t>Progress Report: Automated Testing Suite, QA Auditing &amp; Input Validation Refactoring (Phases 5 &amp; 6)</w:t>
       </w:r>
     </w:p>
     <w:p>
@@ -88,7 +88,7 @@
         <w:t xml:space="preserve">Next Objective: </w:t>
       </w:r>
       <w:r>
-        <w:t>Phase 6 — QA Auditing &amp; Test Scenarios</w:t>
+        <w:t>Phase 6 Completion &amp; Refactoring Audit Report</w:t>
       </w:r>
     </w:p>
     <w:p>
@@ -122,10 +122,10 @@
         <w:spacing w:after="240"/>
       </w:pPr>
       <w:r>
-        <w:t>This progress report summarizes the full implementation milestones for Member 7's assigned Admin Dashboard Panel module (covering database seeding, REST controllers, responsive React layout integration, live catalog CRUD pages, transaction fulfillments, and form validation error-handling shields).</w:t>
+        <w:t>This progress report summarizes the final code hardening, automated integration testing suite implementation, and route-level validation architecture refactoring for Member 7's assigned Admin Dashboard Panel module.</w:t>
         <w:br/>
         <w:br/>
-        <w:t>All admin-facing modules have been fully completed, verified via automated builds, and deployed. The frontend interfaces actively query the backend APIs, rendering live MongoDB database seed records in responsive, modern tables. In accordance with QA requirements, form validation layers, action lockouts, connection failure fallback screens, and custom confirm dialogues are in place.</w:t>
+        <w:t>To enforce strict separation of concerns and robust defensive programming guidelines, all inline body field check blocks were refactored out from the controllers and moved into individual declarative validator schemas. In addition, a self-contained, automated test orchestrator and integration test runner have been implemented to run against a isolated test database instance (ai-healthcare-test). All test cases run and pass successfully.</w:t>
       </w:r>
     </w:p>
     <w:p>
@@ -139,7 +139,158 @@
           <w:color w:val="0E7C86"/>
           <w:sz w:val="28"/>
         </w:rPr>
-        <w:t>2. Core Milestones Completed</w:t>
+        <w:t>2. Input Validation Refactoring (Separation of Concerns)</w:t>
+      </w:r>
+    </w:p>
+    <w:p>
+      <w:pPr>
+        <w:spacing w:after="160"/>
+      </w:pPr>
+      <w:r>
+        <w:t>Previously, incoming HTTP requests were validated inline using conditional 'if' statements inside individual controllers. This polluted controller logic and made validations hard to scale. We have introduced a declarative validation middleware layer using the express-validator library:</w:t>
+      </w:r>
+    </w:p>
+    <w:p>
+      <w:pPr>
+        <w:pStyle w:val="ListBullet"/>
+        <w:spacing w:after="80"/>
+      </w:pPr>
+      <w:r>
+        <w:rPr>
+          <w:b/>
+        </w:rPr>
+        <w:t xml:space="preserve">validateMiddleware.js: </w:t>
+      </w:r>
+      <w:r>
+        <w:t>Centralized runner that calls validationResult(req), catches validation errors, and maps them to a structured JSON 400 Bad Request error packet.</w:t>
+      </w:r>
+    </w:p>
+    <w:p>
+      <w:pPr>
+        <w:pStyle w:val="ListBullet"/>
+        <w:spacing w:after="80"/>
+      </w:pPr>
+      <w:r>
+        <w:rPr>
+          <w:b/>
+        </w:rPr>
+        <w:t xml:space="preserve">doctorValidation.js: </w:t>
+      </w:r>
+      <w:r>
+        <w:t>Validates required fields (fullName, specialization, experienceYears, fees) for doctor creations.</w:t>
+      </w:r>
+    </w:p>
+    <w:p>
+      <w:pPr>
+        <w:pStyle w:val="ListBullet"/>
+        <w:spacing w:after="80"/>
+      </w:pPr>
+      <w:r>
+        <w:rPr>
+          <w:b/>
+        </w:rPr>
+        <w:t xml:space="preserve">medicineValidation.js: </w:t>
+      </w:r>
+      <w:r>
+        <w:t>Enforces non-empty values for names, stock status, categories, price structures, and dosage for pharmacy catalogs.</w:t>
+      </w:r>
+    </w:p>
+    <w:p>
+      <w:pPr>
+        <w:pStyle w:val="ListBullet"/>
+        <w:spacing w:after="80"/>
+      </w:pPr>
+      <w:r>
+        <w:rPr>
+          <w:b/>
+        </w:rPr>
+        <w:t xml:space="preserve">blogValidation.js: </w:t>
+      </w:r>
+      <w:r>
+        <w:t>Validates required attributes (title, categories, markdown contents, cover images, author metadata) for article creations.</w:t>
+      </w:r>
+    </w:p>
+    <w:p>
+      <w:pPr>
+        <w:pStyle w:val="ListBullet"/>
+        <w:spacing w:after="80"/>
+      </w:pPr>
+      <w:r>
+        <w:rPr>
+          <w:b/>
+        </w:rPr>
+        <w:t xml:space="preserve">appointmentValidation.js: </w:t>
+      </w:r>
+      <w:r>
+        <w:t>Enforces status modifications transition boundaries (pending, confirmed, completed, cancelled).</w:t>
+      </w:r>
+    </w:p>
+    <w:p>
+      <w:pPr>
+        <w:pStyle w:val="ListBullet"/>
+        <w:spacing w:after="80"/>
+      </w:pPr>
+      <w:r>
+        <w:rPr>
+          <w:b/>
+        </w:rPr>
+        <w:t xml:space="preserve">orderValidation.js: </w:t>
+      </w:r>
+      <w:r>
+        <w:t>Enforces order status transitions limits (placed, processing, shipped, delivered, cancelled).</w:t>
+      </w:r>
+    </w:p>
+    <w:p>
+      <w:pPr>
+        <w:pStyle w:val="ListBullet"/>
+        <w:spacing w:after="80"/>
+      </w:pPr>
+      <w:r>
+        <w:rPr>
+          <w:b/>
+        </w:rPr>
+        <w:t xml:space="preserve">labBookingValidation.js: </w:t>
+      </w:r>
+      <w:r>
+        <w:t>Enforces lab booking status enums parameters.</w:t>
+      </w:r>
+    </w:p>
+    <w:p>
+      <w:pPr>
+        <w:keepNext/>
+        <w:spacing w:before="360" w:after="160"/>
+      </w:pPr>
+      <w:r>
+        <w:rPr>
+          <w:b/>
+          <w:color w:val="0E7C86"/>
+          <w:sz w:val="28"/>
+        </w:rPr>
+        <w:t>3. Automated Integration Testing Architecture</w:t>
+      </w:r>
+    </w:p>
+    <w:p>
+      <w:pPr>
+        <w:spacing w:after="120"/>
+      </w:pPr>
+      <w:r>
+        <w:t>The automated test suite runs against a dedicated test environment without affecting production or local development databases:</w:t>
+      </w:r>
+    </w:p>
+    <w:p>
+      <w:pPr>
+        <w:pStyle w:val="ListBullet"/>
+      </w:pPr>
+      <w:r>
+        <w:t>Test Orchestrator (tests/run.js): Sets env values, triggers clean mock data seeding, spawns the Express server as a subprocess on port 5999, runs tests, and tears down the subprocess on exit.</w:t>
+      </w:r>
+    </w:p>
+    <w:p>
+      <w:pPr>
+        <w:pStyle w:val="ListBullet"/>
+      </w:pPr>
+      <w:r>
+        <w:t>Test Runner (tests/qa.test.js): Employs Node's native test library (node --test and node:assert). It validates authentication bounds, status flow changes, soft-deactivation flags, and boundary checks.</w:t>
       </w:r>
     </w:p>
     <w:p>
@@ -153,105 +304,1012 @@
           <w:color w:val="2E75B6"/>
           <w:sz w:val="24"/>
         </w:rPr>
-        <w:t>A. Database Seeding &amp; Schema Setup (Phase 1)</w:t>
+        <w:t>Automated Test Cases Coverage Matrix</w:t>
       </w:r>
     </w:p>
-    <w:p>
-      <w:pPr>
-        <w:pStyle w:val="ListBullet"/>
-      </w:pPr>
-      <w:r>
-        <w:t>Defined standard Mongoose schemas for all 10 project collections (User, Doctor, Appointment with double-booking prevention, Medicine, Order with historical price snapshots, LabTest, LabBooking, EmergencyContact, Blog, and ContactMessage). Created an automated master seed script to clear and populate database records.</w:t>
-      </w:r>
-    </w:p>
-    <w:p>
-      <w:pPr>
-        <w:keepNext/>
-        <w:spacing w:before="240" w:after="120"/>
-      </w:pPr>
-      <w:r>
-        <w:rPr>
-          <w:b/>
-          <w:color w:val="2E75B6"/>
-          <w:sz w:val="24"/>
-        </w:rPr>
-        <w:t>B. ES Modules Backend APIs (Phase 2)</w:t>
-      </w:r>
-    </w:p>
-    <w:p>
-      <w:pPr>
-        <w:pStyle w:val="ListBullet"/>
-      </w:pPr>
-      <w:r>
-        <w:t>Refactored the entire backend server configuration and routing folders to native ES Modules (ESM). Implemented secure REST controller routes under /api/admin/* (Doctors CRUD, Medicines CRUD, Blogs CRUD, and status fulfillments for appointments, lab tests, and orders) guarded behind JWT authentication and role-checking middleware.</w:t>
-      </w:r>
-    </w:p>
-    <w:p>
-      <w:pPr>
-        <w:keepNext/>
-        <w:spacing w:before="240" w:after="120"/>
-      </w:pPr>
-      <w:r>
-        <w:rPr>
-          <w:b/>
-          <w:color w:val="2E75B6"/>
-          <w:sz w:val="24"/>
-        </w:rPr>
-        <w:t>C. Layout Shell &amp; Analytics Graphs (Phase 3)</w:t>
-      </w:r>
-    </w:p>
-    <w:p>
-      <w:pPr>
-        <w:pStyle w:val="ListBullet"/>
-      </w:pPr>
-      <w:r>
-        <w:t>Constructed a premium, responsive React admin shell layout (AdminLayout.jsx) with a left navigation sidebar drawer (AdminSidebar.jsx). Integrated dynamic weekly clinics activity area charts and lab test loads bar charts using the Recharts library on the Dashboard.</w:t>
-      </w:r>
-    </w:p>
-    <w:p>
-      <w:pPr>
-        <w:keepNext/>
-        <w:spacing w:before="240" w:after="120"/>
-      </w:pPr>
-      <w:r>
-        <w:rPr>
-          <w:b/>
-          <w:color w:val="2E75B6"/>
-          <w:sz w:val="24"/>
-        </w:rPr>
-        <w:t>D. Live Collection CRUD pages (Phase 4)</w:t>
-      </w:r>
-    </w:p>
-    <w:p>
-      <w:pPr>
-        <w:pStyle w:val="ListBullet"/>
-      </w:pPr>
-      <w:r>
-        <w:t>Designed and mapped all administrative subpages. Enhanced the backend API with paginated GET list routes for all collections. Converted frontend placeholders to render active database records dynamically.</w:t>
-      </w:r>
-    </w:p>
-    <w:p>
-      <w:pPr>
-        <w:keepNext/>
-        <w:spacing w:before="240" w:after="120"/>
-      </w:pPr>
-      <w:r>
-        <w:rPr>
-          <w:b/>
-          <w:color w:val="2E75B6"/>
-          <w:sz w:val="24"/>
-        </w:rPr>
-        <w:t>E. Form Validations &amp; QA Error Shields (Phase 5)</w:t>
-      </w:r>
-    </w:p>
-    <w:p>
-      <w:pPr>
-        <w:pStyle w:val="ListBullet"/>
-      </w:pPr>
-      <w:r>
-        <w:t>Harkened input fields against empty inputs or negative values. Prevented double submits by locking click triggers. Created custom absolute-overlay deactivation popups, and added connection failure error-warning banners if API requests fail.</w:t>
-      </w:r>
-    </w:p>
+    <w:tbl>
+      <w:tblPr>
+        <w:tblW w:type="auto" w:w="0"/>
+        <w:tblLayout w:type="fixed"/>
+        <w:tblLook w:firstColumn="1" w:firstRow="1" w:lastColumn="0" w:lastRow="0" w:noHBand="0" w:noVBand="1" w:val="04A0"/>
+      </w:tblPr>
+      <w:tblGrid>
+        <w:gridCol w:w="2340"/>
+        <w:gridCol w:w="2340"/>
+        <w:gridCol w:w="2340"/>
+        <w:gridCol w:w="2340"/>
+      </w:tblGrid>
+      <w:tr>
+        <w:tc>
+          <w:tcPr>
+            <w:tcW w:type="dxa" w:w="3168"/>
+            <w:shd w:fill="0E7C86"/>
+            <w:tcMar>
+              <w:top w:w="100" w:type="dxa"/>
+              <w:bottom w:w="100" w:type="dxa"/>
+              <w:left w:w="150" w:type="dxa"/>
+              <w:right w:w="150" w:type="dxa"/>
+            </w:tcMar>
+          </w:tcPr>
+          <w:p>
+            <w:r>
+              <w:rPr>
+                <w:b/>
+                <w:color w:val="FFFFFF"/>
+                <w:sz w:val="19"/>
+              </w:rPr>
+              <w:t>API Endpoint Checked</w:t>
+            </w:r>
+          </w:p>
+        </w:tc>
+        <w:tc>
+          <w:tcPr>
+            <w:tcW w:type="dxa" w:w="1872"/>
+            <w:shd w:fill="0E7C86"/>
+            <w:tcMar>
+              <w:top w:w="100" w:type="dxa"/>
+              <w:bottom w:w="100" w:type="dxa"/>
+              <w:left w:w="150" w:type="dxa"/>
+              <w:right w:w="150" w:type="dxa"/>
+            </w:tcMar>
+          </w:tcPr>
+          <w:p>
+            <w:r>
+              <w:rPr>
+                <w:b/>
+                <w:color w:val="FFFFFF"/>
+                <w:sz w:val="19"/>
+              </w:rPr>
+              <w:t>Input Scenario</w:t>
+            </w:r>
+          </w:p>
+        </w:tc>
+        <w:tc>
+          <w:tcPr>
+            <w:tcW w:type="dxa" w:w="2160"/>
+            <w:shd w:fill="0E7C86"/>
+            <w:tcMar>
+              <w:top w:w="100" w:type="dxa"/>
+              <w:bottom w:w="100" w:type="dxa"/>
+              <w:left w:w="150" w:type="dxa"/>
+              <w:right w:w="150" w:type="dxa"/>
+            </w:tcMar>
+          </w:tcPr>
+          <w:p>
+            <w:r>
+              <w:rPr>
+                <w:b/>
+                <w:color w:val="FFFFFF"/>
+                <w:sz w:val="19"/>
+              </w:rPr>
+              <w:t>Expected Outcome</w:t>
+            </w:r>
+          </w:p>
+        </w:tc>
+        <w:tc>
+          <w:tcPr>
+            <w:tcW w:type="dxa" w:w="2880"/>
+            <w:shd w:fill="0E7C86"/>
+            <w:tcMar>
+              <w:top w:w="100" w:type="dxa"/>
+              <w:bottom w:w="100" w:type="dxa"/>
+              <w:left w:w="150" w:type="dxa"/>
+              <w:right w:w="150" w:type="dxa"/>
+            </w:tcMar>
+          </w:tcPr>
+          <w:p>
+            <w:r>
+              <w:rPr>
+                <w:b/>
+                <w:color w:val="FFFFFF"/>
+                <w:sz w:val="19"/>
+              </w:rPr>
+              <w:t>Validation / Target Check</w:t>
+            </w:r>
+          </w:p>
+        </w:tc>
+      </w:tr>
+      <w:tr>
+        <w:tc>
+          <w:tcPr>
+            <w:tcW w:type="dxa" w:w="3168"/>
+            <w:tcMar>
+              <w:top w:w="100" w:type="dxa"/>
+              <w:bottom w:w="100" w:type="dxa"/>
+              <w:left w:w="150" w:type="dxa"/>
+              <w:right w:w="150" w:type="dxa"/>
+            </w:tcMar>
+          </w:tcPr>
+          <w:p>
+            <w:r>
+              <w:rPr>
+                <w:rFonts w:ascii="Consolas" w:hAnsi="Consolas"/>
+                <w:b/>
+                <w:sz w:val="17"/>
+              </w:rPr>
+              <w:t>GET /admin/doctors</w:t>
+            </w:r>
+          </w:p>
+        </w:tc>
+        <w:tc>
+          <w:tcPr>
+            <w:tcW w:type="dxa" w:w="1872"/>
+            <w:tcMar>
+              <w:top w:w="100" w:type="dxa"/>
+              <w:bottom w:w="100" w:type="dxa"/>
+              <w:left w:w="150" w:type="dxa"/>
+              <w:right w:w="150" w:type="dxa"/>
+            </w:tcMar>
+          </w:tcPr>
+          <w:p>
+            <w:r>
+              <w:rPr>
+                <w:sz w:val="18"/>
+              </w:rPr>
+              <w:t>No Token</w:t>
+            </w:r>
+          </w:p>
+        </w:tc>
+        <w:tc>
+          <w:tcPr>
+            <w:tcW w:type="dxa" w:w="2160"/>
+            <w:tcMar>
+              <w:top w:w="100" w:type="dxa"/>
+              <w:bottom w:w="100" w:type="dxa"/>
+              <w:left w:w="150" w:type="dxa"/>
+              <w:right w:w="150" w:type="dxa"/>
+            </w:tcMar>
+          </w:tcPr>
+          <w:p>
+            <w:r>
+              <w:rPr>
+                <w:sz w:val="18"/>
+              </w:rPr>
+              <w:t>401 Unauthorized</w:t>
+            </w:r>
+          </w:p>
+        </w:tc>
+        <w:tc>
+          <w:tcPr>
+            <w:tcW w:type="dxa" w:w="2880"/>
+            <w:tcMar>
+              <w:top w:w="100" w:type="dxa"/>
+              <w:bottom w:w="100" w:type="dxa"/>
+              <w:left w:w="150" w:type="dxa"/>
+              <w:right w:w="150" w:type="dxa"/>
+            </w:tcMar>
+          </w:tcPr>
+          <w:p>
+            <w:r>
+              <w:rPr>
+                <w:sz w:val="18"/>
+              </w:rPr>
+              <w:t>Verify auth token requirements</w:t>
+            </w:r>
+          </w:p>
+        </w:tc>
+      </w:tr>
+      <w:tr>
+        <w:tc>
+          <w:tcPr>
+            <w:tcW w:type="dxa" w:w="3168"/>
+            <w:tcMar>
+              <w:top w:w="100" w:type="dxa"/>
+              <w:bottom w:w="100" w:type="dxa"/>
+              <w:left w:w="150" w:type="dxa"/>
+              <w:right w:w="150" w:type="dxa"/>
+            </w:tcMar>
+            <w:shd w:fill="F4F9F9"/>
+          </w:tcPr>
+          <w:p>
+            <w:r>
+              <w:rPr>
+                <w:rFonts w:ascii="Consolas" w:hAnsi="Consolas"/>
+                <w:b/>
+                <w:sz w:val="17"/>
+              </w:rPr>
+              <w:t>GET /admin/doctors</w:t>
+            </w:r>
+          </w:p>
+        </w:tc>
+        <w:tc>
+          <w:tcPr>
+            <w:tcW w:type="dxa" w:w="1872"/>
+            <w:tcMar>
+              <w:top w:w="100" w:type="dxa"/>
+              <w:bottom w:w="100" w:type="dxa"/>
+              <w:left w:w="150" w:type="dxa"/>
+              <w:right w:w="150" w:type="dxa"/>
+            </w:tcMar>
+            <w:shd w:fill="F4F9F9"/>
+          </w:tcPr>
+          <w:p>
+            <w:r>
+              <w:rPr>
+                <w:sz w:val="18"/>
+              </w:rPr>
+              <w:t>Patient Token</w:t>
+            </w:r>
+          </w:p>
+        </w:tc>
+        <w:tc>
+          <w:tcPr>
+            <w:tcW w:type="dxa" w:w="2160"/>
+            <w:tcMar>
+              <w:top w:w="100" w:type="dxa"/>
+              <w:bottom w:w="100" w:type="dxa"/>
+              <w:left w:w="150" w:type="dxa"/>
+              <w:right w:w="150" w:type="dxa"/>
+            </w:tcMar>
+            <w:shd w:fill="F4F9F9"/>
+          </w:tcPr>
+          <w:p>
+            <w:r>
+              <w:rPr>
+                <w:sz w:val="18"/>
+              </w:rPr>
+              <w:t>403 Forbidden</w:t>
+            </w:r>
+          </w:p>
+        </w:tc>
+        <w:tc>
+          <w:tcPr>
+            <w:tcW w:type="dxa" w:w="2880"/>
+            <w:tcMar>
+              <w:top w:w="100" w:type="dxa"/>
+              <w:bottom w:w="100" w:type="dxa"/>
+              <w:left w:w="150" w:type="dxa"/>
+              <w:right w:w="150" w:type="dxa"/>
+            </w:tcMar>
+            <w:shd w:fill="F4F9F9"/>
+          </w:tcPr>
+          <w:p>
+            <w:r>
+              <w:rPr>
+                <w:sz w:val="18"/>
+              </w:rPr>
+              <w:t>Verify admin authorization restriction</w:t>
+            </w:r>
+          </w:p>
+        </w:tc>
+      </w:tr>
+      <w:tr>
+        <w:tc>
+          <w:tcPr>
+            <w:tcW w:type="dxa" w:w="3168"/>
+            <w:tcMar>
+              <w:top w:w="100" w:type="dxa"/>
+              <w:bottom w:w="100" w:type="dxa"/>
+              <w:left w:w="150" w:type="dxa"/>
+              <w:right w:w="150" w:type="dxa"/>
+            </w:tcMar>
+          </w:tcPr>
+          <w:p>
+            <w:r>
+              <w:rPr>
+                <w:rFonts w:ascii="Consolas" w:hAnsi="Consolas"/>
+                <w:b/>
+                <w:sz w:val="17"/>
+              </w:rPr>
+              <w:t>POST /auth/login</w:t>
+            </w:r>
+          </w:p>
+        </w:tc>
+        <w:tc>
+          <w:tcPr>
+            <w:tcW w:type="dxa" w:w="1872"/>
+            <w:tcMar>
+              <w:top w:w="100" w:type="dxa"/>
+              <w:bottom w:w="100" w:type="dxa"/>
+              <w:left w:w="150" w:type="dxa"/>
+              <w:right w:w="150" w:type="dxa"/>
+            </w:tcMar>
+          </w:tcPr>
+          <w:p>
+            <w:r>
+              <w:rPr>
+                <w:sz w:val="18"/>
+              </w:rPr>
+              <w:t>Admin Credentials</w:t>
+            </w:r>
+          </w:p>
+        </w:tc>
+        <w:tc>
+          <w:tcPr>
+            <w:tcW w:type="dxa" w:w="2160"/>
+            <w:tcMar>
+              <w:top w:w="100" w:type="dxa"/>
+              <w:bottom w:w="100" w:type="dxa"/>
+              <w:left w:w="150" w:type="dxa"/>
+              <w:right w:w="150" w:type="dxa"/>
+            </w:tcMar>
+          </w:tcPr>
+          <w:p>
+            <w:r>
+              <w:rPr>
+                <w:sz w:val="18"/>
+              </w:rPr>
+              <w:t>200 OK + Token</w:t>
+            </w:r>
+          </w:p>
+        </w:tc>
+        <w:tc>
+          <w:tcPr>
+            <w:tcW w:type="dxa" w:w="2880"/>
+            <w:tcMar>
+              <w:top w:w="100" w:type="dxa"/>
+              <w:bottom w:w="100" w:type="dxa"/>
+              <w:left w:w="150" w:type="dxa"/>
+              <w:right w:w="150" w:type="dxa"/>
+            </w:tcMar>
+          </w:tcPr>
+          <w:p>
+            <w:r>
+              <w:rPr>
+                <w:sz w:val="18"/>
+              </w:rPr>
+              <w:t>Verify administrative login flow</w:t>
+            </w:r>
+          </w:p>
+        </w:tc>
+      </w:tr>
+      <w:tr>
+        <w:tc>
+          <w:tcPr>
+            <w:tcW w:type="dxa" w:w="3168"/>
+            <w:tcMar>
+              <w:top w:w="100" w:type="dxa"/>
+              <w:bottom w:w="100" w:type="dxa"/>
+              <w:left w:w="150" w:type="dxa"/>
+              <w:right w:w="150" w:type="dxa"/>
+            </w:tcMar>
+            <w:shd w:fill="F4F9F9"/>
+          </w:tcPr>
+          <w:p>
+            <w:r>
+              <w:rPr>
+                <w:rFonts w:ascii="Consolas" w:hAnsi="Consolas"/>
+                <w:b/>
+                <w:sz w:val="17"/>
+              </w:rPr>
+              <w:t>PATCH /admin/appointments/:id/status</w:t>
+            </w:r>
+          </w:p>
+        </w:tc>
+        <w:tc>
+          <w:tcPr>
+            <w:tcW w:type="dxa" w:w="1872"/>
+            <w:tcMar>
+              <w:top w:w="100" w:type="dxa"/>
+              <w:bottom w:w="100" w:type="dxa"/>
+              <w:left w:w="150" w:type="dxa"/>
+              <w:right w:w="150" w:type="dxa"/>
+            </w:tcMar>
+            <w:shd w:fill="F4F9F9"/>
+          </w:tcPr>
+          <w:p>
+            <w:r>
+              <w:rPr>
+                <w:sz w:val="18"/>
+              </w:rPr>
+              <w:t>Admin Token</w:t>
+            </w:r>
+          </w:p>
+        </w:tc>
+        <w:tc>
+          <w:tcPr>
+            <w:tcW w:type="dxa" w:w="2160"/>
+            <w:tcMar>
+              <w:top w:w="100" w:type="dxa"/>
+              <w:bottom w:w="100" w:type="dxa"/>
+              <w:left w:w="150" w:type="dxa"/>
+              <w:right w:w="150" w:type="dxa"/>
+            </w:tcMar>
+            <w:shd w:fill="F4F9F9"/>
+          </w:tcPr>
+          <w:p>
+            <w:r>
+              <w:rPr>
+                <w:sz w:val="18"/>
+              </w:rPr>
+              <w:t>200 OK</w:t>
+            </w:r>
+          </w:p>
+        </w:tc>
+        <w:tc>
+          <w:tcPr>
+            <w:tcW w:type="dxa" w:w="2880"/>
+            <w:tcMar>
+              <w:top w:w="100" w:type="dxa"/>
+              <w:bottom w:w="100" w:type="dxa"/>
+              <w:left w:w="150" w:type="dxa"/>
+              <w:right w:w="150" w:type="dxa"/>
+            </w:tcMar>
+            <w:shd w:fill="F4F9F9"/>
+          </w:tcPr>
+          <w:p>
+            <w:r>
+              <w:rPr>
+                <w:sz w:val="18"/>
+              </w:rPr>
+              <w:t>Verify pending -&gt; confirmed transitions</w:t>
+            </w:r>
+          </w:p>
+        </w:tc>
+      </w:tr>
+      <w:tr>
+        <w:tc>
+          <w:tcPr>
+            <w:tcW w:type="dxa" w:w="3168"/>
+            <w:tcMar>
+              <w:top w:w="100" w:type="dxa"/>
+              <w:bottom w:w="100" w:type="dxa"/>
+              <w:left w:w="150" w:type="dxa"/>
+              <w:right w:w="150" w:type="dxa"/>
+            </w:tcMar>
+          </w:tcPr>
+          <w:p>
+            <w:r>
+              <w:rPr>
+                <w:rFonts w:ascii="Consolas" w:hAnsi="Consolas"/>
+                <w:b/>
+                <w:sz w:val="17"/>
+              </w:rPr>
+              <w:t>PATCH /admin/orders/:id/status</w:t>
+            </w:r>
+          </w:p>
+        </w:tc>
+        <w:tc>
+          <w:tcPr>
+            <w:tcW w:type="dxa" w:w="1872"/>
+            <w:tcMar>
+              <w:top w:w="100" w:type="dxa"/>
+              <w:bottom w:w="100" w:type="dxa"/>
+              <w:left w:w="150" w:type="dxa"/>
+              <w:right w:w="150" w:type="dxa"/>
+            </w:tcMar>
+          </w:tcPr>
+          <w:p>
+            <w:r>
+              <w:rPr>
+                <w:sz w:val="18"/>
+              </w:rPr>
+              <w:t>Admin Token</w:t>
+            </w:r>
+          </w:p>
+        </w:tc>
+        <w:tc>
+          <w:tcPr>
+            <w:tcW w:type="dxa" w:w="2160"/>
+            <w:tcMar>
+              <w:top w:w="100" w:type="dxa"/>
+              <w:bottom w:w="100" w:type="dxa"/>
+              <w:left w:w="150" w:type="dxa"/>
+              <w:right w:w="150" w:type="dxa"/>
+            </w:tcMar>
+          </w:tcPr>
+          <w:p>
+            <w:r>
+              <w:rPr>
+                <w:sz w:val="18"/>
+              </w:rPr>
+              <w:t>200 OK</w:t>
+            </w:r>
+          </w:p>
+        </w:tc>
+        <w:tc>
+          <w:tcPr>
+            <w:tcW w:type="dxa" w:w="2880"/>
+            <w:tcMar>
+              <w:top w:w="100" w:type="dxa"/>
+              <w:bottom w:w="100" w:type="dxa"/>
+              <w:left w:w="150" w:type="dxa"/>
+              <w:right w:w="150" w:type="dxa"/>
+            </w:tcMar>
+          </w:tcPr>
+          <w:p>
+            <w:r>
+              <w:rPr>
+                <w:sz w:val="18"/>
+              </w:rPr>
+              <w:t>Verify placed -&gt; processing transitions</w:t>
+            </w:r>
+          </w:p>
+        </w:tc>
+      </w:tr>
+      <w:tr>
+        <w:tc>
+          <w:tcPr>
+            <w:tcW w:type="dxa" w:w="3168"/>
+            <w:tcMar>
+              <w:top w:w="100" w:type="dxa"/>
+              <w:bottom w:w="100" w:type="dxa"/>
+              <w:left w:w="150" w:type="dxa"/>
+              <w:right w:w="150" w:type="dxa"/>
+            </w:tcMar>
+            <w:shd w:fill="F4F9F9"/>
+          </w:tcPr>
+          <w:p>
+            <w:r>
+              <w:rPr>
+                <w:rFonts w:ascii="Consolas" w:hAnsi="Consolas"/>
+                <w:b/>
+                <w:sz w:val="17"/>
+              </w:rPr>
+              <w:t>PATCH /admin/lab-bookings/:id/status</w:t>
+            </w:r>
+          </w:p>
+        </w:tc>
+        <w:tc>
+          <w:tcPr>
+            <w:tcW w:type="dxa" w:w="1872"/>
+            <w:tcMar>
+              <w:top w:w="100" w:type="dxa"/>
+              <w:bottom w:w="100" w:type="dxa"/>
+              <w:left w:w="150" w:type="dxa"/>
+              <w:right w:w="150" w:type="dxa"/>
+            </w:tcMar>
+            <w:shd w:fill="F4F9F9"/>
+          </w:tcPr>
+          <w:p>
+            <w:r>
+              <w:rPr>
+                <w:sz w:val="18"/>
+              </w:rPr>
+              <w:t>Admin Token</w:t>
+            </w:r>
+          </w:p>
+        </w:tc>
+        <w:tc>
+          <w:tcPr>
+            <w:tcW w:type="dxa" w:w="2160"/>
+            <w:tcMar>
+              <w:top w:w="100" w:type="dxa"/>
+              <w:bottom w:w="100" w:type="dxa"/>
+              <w:left w:w="150" w:type="dxa"/>
+              <w:right w:w="150" w:type="dxa"/>
+            </w:tcMar>
+            <w:shd w:fill="F4F9F9"/>
+          </w:tcPr>
+          <w:p>
+            <w:r>
+              <w:rPr>
+                <w:sz w:val="18"/>
+              </w:rPr>
+              <w:t>200 OK</w:t>
+            </w:r>
+          </w:p>
+        </w:tc>
+        <w:tc>
+          <w:tcPr>
+            <w:tcW w:type="dxa" w:w="2880"/>
+            <w:tcMar>
+              <w:top w:w="100" w:type="dxa"/>
+              <w:bottom w:w="100" w:type="dxa"/>
+              <w:left w:w="150" w:type="dxa"/>
+              <w:right w:w="150" w:type="dxa"/>
+            </w:tcMar>
+            <w:shd w:fill="F4F9F9"/>
+          </w:tcPr>
+          <w:p>
+            <w:r>
+              <w:rPr>
+                <w:sz w:val="18"/>
+              </w:rPr>
+              <w:t>Verify pending -&gt; cancelled transitions</w:t>
+            </w:r>
+          </w:p>
+        </w:tc>
+      </w:tr>
+      <w:tr>
+        <w:tc>
+          <w:tcPr>
+            <w:tcW w:type="dxa" w:w="3168"/>
+            <w:tcMar>
+              <w:top w:w="100" w:type="dxa"/>
+              <w:bottom w:w="100" w:type="dxa"/>
+              <w:left w:w="150" w:type="dxa"/>
+              <w:right w:w="150" w:type="dxa"/>
+            </w:tcMar>
+          </w:tcPr>
+          <w:p>
+            <w:r>
+              <w:rPr>
+                <w:rFonts w:ascii="Consolas" w:hAnsi="Consolas"/>
+                <w:b/>
+                <w:sz w:val="17"/>
+              </w:rPr>
+              <w:t>DELETE /admin/doctors/:id</w:t>
+            </w:r>
+          </w:p>
+        </w:tc>
+        <w:tc>
+          <w:tcPr>
+            <w:tcW w:type="dxa" w:w="1872"/>
+            <w:tcMar>
+              <w:top w:w="100" w:type="dxa"/>
+              <w:bottom w:w="100" w:type="dxa"/>
+              <w:left w:w="150" w:type="dxa"/>
+              <w:right w:w="150" w:type="dxa"/>
+            </w:tcMar>
+          </w:tcPr>
+          <w:p>
+            <w:r>
+              <w:rPr>
+                <w:sz w:val="18"/>
+              </w:rPr>
+              <w:t>Admin Token</w:t>
+            </w:r>
+          </w:p>
+        </w:tc>
+        <w:tc>
+          <w:tcPr>
+            <w:tcW w:type="dxa" w:w="2160"/>
+            <w:tcMar>
+              <w:top w:w="100" w:type="dxa"/>
+              <w:bottom w:w="100" w:type="dxa"/>
+              <w:left w:w="150" w:type="dxa"/>
+              <w:right w:w="150" w:type="dxa"/>
+            </w:tcMar>
+          </w:tcPr>
+          <w:p>
+            <w:r>
+              <w:rPr>
+                <w:sz w:val="18"/>
+              </w:rPr>
+              <w:t>200 OK (isActive: false)</w:t>
+            </w:r>
+          </w:p>
+        </w:tc>
+        <w:tc>
+          <w:tcPr>
+            <w:tcW w:type="dxa" w:w="2880"/>
+            <w:tcMar>
+              <w:top w:w="100" w:type="dxa"/>
+              <w:bottom w:w="100" w:type="dxa"/>
+              <w:left w:w="150" w:type="dxa"/>
+              <w:right w:w="150" w:type="dxa"/>
+            </w:tcMar>
+          </w:tcPr>
+          <w:p>
+            <w:r>
+              <w:rPr>
+                <w:sz w:val="18"/>
+              </w:rPr>
+              <w:t>Verify doctor soft deactivation</w:t>
+            </w:r>
+          </w:p>
+        </w:tc>
+      </w:tr>
+      <w:tr>
+        <w:tc>
+          <w:tcPr>
+            <w:tcW w:type="dxa" w:w="3168"/>
+            <w:tcMar>
+              <w:top w:w="100" w:type="dxa"/>
+              <w:bottom w:w="100" w:type="dxa"/>
+              <w:left w:w="150" w:type="dxa"/>
+              <w:right w:w="150" w:type="dxa"/>
+            </w:tcMar>
+            <w:shd w:fill="F4F9F9"/>
+          </w:tcPr>
+          <w:p>
+            <w:r>
+              <w:rPr>
+                <w:rFonts w:ascii="Consolas" w:hAnsi="Consolas"/>
+                <w:b/>
+                <w:sz w:val="17"/>
+              </w:rPr>
+              <w:t>DELETE /admin/medicines/:id</w:t>
+            </w:r>
+          </w:p>
+        </w:tc>
+        <w:tc>
+          <w:tcPr>
+            <w:tcW w:type="dxa" w:w="1872"/>
+            <w:tcMar>
+              <w:top w:w="100" w:type="dxa"/>
+              <w:bottom w:w="100" w:type="dxa"/>
+              <w:left w:w="150" w:type="dxa"/>
+              <w:right w:w="150" w:type="dxa"/>
+            </w:tcMar>
+            <w:shd w:fill="F4F9F9"/>
+          </w:tcPr>
+          <w:p>
+            <w:r>
+              <w:rPr>
+                <w:sz w:val="18"/>
+              </w:rPr>
+              <w:t>Admin Token</w:t>
+            </w:r>
+          </w:p>
+        </w:tc>
+        <w:tc>
+          <w:tcPr>
+            <w:tcW w:type="dxa" w:w="2160"/>
+            <w:tcMar>
+              <w:top w:w="100" w:type="dxa"/>
+              <w:bottom w:w="100" w:type="dxa"/>
+              <w:left w:w="150" w:type="dxa"/>
+              <w:right w:w="150" w:type="dxa"/>
+            </w:tcMar>
+            <w:shd w:fill="F4F9F9"/>
+          </w:tcPr>
+          <w:p>
+            <w:r>
+              <w:rPr>
+                <w:sz w:val="18"/>
+              </w:rPr>
+              <w:t>200 OK (isActive: false)</w:t>
+            </w:r>
+          </w:p>
+        </w:tc>
+        <w:tc>
+          <w:tcPr>
+            <w:tcW w:type="dxa" w:w="2880"/>
+            <w:tcMar>
+              <w:top w:w="100" w:type="dxa"/>
+              <w:bottom w:w="100" w:type="dxa"/>
+              <w:left w:w="150" w:type="dxa"/>
+              <w:right w:w="150" w:type="dxa"/>
+            </w:tcMar>
+            <w:shd w:fill="F4F9F9"/>
+          </w:tcPr>
+          <w:p>
+            <w:r>
+              <w:rPr>
+                <w:sz w:val="18"/>
+              </w:rPr>
+              <w:t>Verify medicine soft deactivation</w:t>
+            </w:r>
+          </w:p>
+        </w:tc>
+      </w:tr>
+      <w:tr>
+        <w:tc>
+          <w:tcPr>
+            <w:tcW w:type="dxa" w:w="3168"/>
+            <w:tcMar>
+              <w:top w:w="100" w:type="dxa"/>
+              <w:bottom w:w="100" w:type="dxa"/>
+              <w:left w:w="150" w:type="dxa"/>
+              <w:right w:w="150" w:type="dxa"/>
+            </w:tcMar>
+          </w:tcPr>
+          <w:p>
+            <w:r>
+              <w:rPr>
+                <w:rFonts w:ascii="Consolas" w:hAnsi="Consolas"/>
+                <w:b/>
+                <w:sz w:val="17"/>
+              </w:rPr>
+              <w:t>POST /admin/doctors</w:t>
+            </w:r>
+          </w:p>
+        </w:tc>
+        <w:tc>
+          <w:tcPr>
+            <w:tcW w:type="dxa" w:w="1872"/>
+            <w:tcMar>
+              <w:top w:w="100" w:type="dxa"/>
+              <w:bottom w:w="100" w:type="dxa"/>
+              <w:left w:w="150" w:type="dxa"/>
+              <w:right w:w="150" w:type="dxa"/>
+            </w:tcMar>
+          </w:tcPr>
+          <w:p>
+            <w:r>
+              <w:rPr>
+                <w:sz w:val="18"/>
+              </w:rPr>
+              <w:t>Missing name field</w:t>
+            </w:r>
+          </w:p>
+        </w:tc>
+        <w:tc>
+          <w:tcPr>
+            <w:tcW w:type="dxa" w:w="2160"/>
+            <w:tcMar>
+              <w:top w:w="100" w:type="dxa"/>
+              <w:bottom w:w="100" w:type="dxa"/>
+              <w:left w:w="150" w:type="dxa"/>
+              <w:right w:w="150" w:type="dxa"/>
+            </w:tcMar>
+          </w:tcPr>
+          <w:p>
+            <w:r>
+              <w:rPr>
+                <w:sz w:val="18"/>
+              </w:rPr>
+              <w:t>400 Bad Request</w:t>
+            </w:r>
+          </w:p>
+        </w:tc>
+        <w:tc>
+          <w:tcPr>
+            <w:tcW w:type="dxa" w:w="2880"/>
+            <w:tcMar>
+              <w:top w:w="100" w:type="dxa"/>
+              <w:bottom w:w="100" w:type="dxa"/>
+              <w:left w:w="150" w:type="dxa"/>
+              <w:right w:w="150" w:type="dxa"/>
+            </w:tcMar>
+          </w:tcPr>
+          <w:p>
+            <w:r>
+              <w:rPr>
+                <w:sz w:val="18"/>
+              </w:rPr>
+              <w:t>Verify required properties validation</w:t>
+            </w:r>
+          </w:p>
+        </w:tc>
+      </w:tr>
+      <w:tr>
+        <w:tc>
+          <w:tcPr>
+            <w:tcW w:type="dxa" w:w="3168"/>
+            <w:tcMar>
+              <w:top w:w="100" w:type="dxa"/>
+              <w:bottom w:w="100" w:type="dxa"/>
+              <w:left w:w="150" w:type="dxa"/>
+              <w:right w:w="150" w:type="dxa"/>
+            </w:tcMar>
+            <w:shd w:fill="F4F9F9"/>
+          </w:tcPr>
+          <w:p>
+            <w:r>
+              <w:rPr>
+                <w:rFonts w:ascii="Consolas" w:hAnsi="Consolas"/>
+                <w:b/>
+                <w:sz w:val="17"/>
+              </w:rPr>
+              <w:t>POST /admin/medicines</w:t>
+            </w:r>
+          </w:p>
+        </w:tc>
+        <w:tc>
+          <w:tcPr>
+            <w:tcW w:type="dxa" w:w="1872"/>
+            <w:tcMar>
+              <w:top w:w="100" w:type="dxa"/>
+              <w:bottom w:w="100" w:type="dxa"/>
+              <w:left w:w="150" w:type="dxa"/>
+              <w:right w:w="150" w:type="dxa"/>
+            </w:tcMar>
+            <w:shd w:fill="F4F9F9"/>
+          </w:tcPr>
+          <w:p>
+            <w:r>
+              <w:rPr>
+                <w:sz w:val="18"/>
+              </w:rPr>
+              <w:t>Negative price value</w:t>
+            </w:r>
+          </w:p>
+        </w:tc>
+        <w:tc>
+          <w:tcPr>
+            <w:tcW w:type="dxa" w:w="2160"/>
+            <w:tcMar>
+              <w:top w:w="100" w:type="dxa"/>
+              <w:bottom w:w="100" w:type="dxa"/>
+              <w:left w:w="150" w:type="dxa"/>
+              <w:right w:w="150" w:type="dxa"/>
+            </w:tcMar>
+            <w:shd w:fill="F4F9F9"/>
+          </w:tcPr>
+          <w:p>
+            <w:r>
+              <w:rPr>
+                <w:sz w:val="18"/>
+              </w:rPr>
+              <w:t>400 Bad Request</w:t>
+            </w:r>
+          </w:p>
+        </w:tc>
+        <w:tc>
+          <w:tcPr>
+            <w:tcW w:type="dxa" w:w="2880"/>
+            <w:tcMar>
+              <w:top w:w="100" w:type="dxa"/>
+              <w:bottom w:w="100" w:type="dxa"/>
+              <w:left w:w="150" w:type="dxa"/>
+              <w:right w:w="150" w:type="dxa"/>
+            </w:tcMar>
+            <w:shd w:fill="F4F9F9"/>
+          </w:tcPr>
+          <w:p>
+            <w:r>
+              <w:rPr>
+                <w:sz w:val="18"/>
+              </w:rPr>
+              <w:t>Verify range validation check</w:t>
+            </w:r>
+          </w:p>
+        </w:tc>
+      </w:tr>
+      <w:tr>
+        <w:tc>
+          <w:tcPr>
+            <w:tcW w:type="dxa" w:w="3168"/>
+            <w:tcMar>
+              <w:top w:w="100" w:type="dxa"/>
+              <w:bottom w:w="100" w:type="dxa"/>
+              <w:left w:w="150" w:type="dxa"/>
+              <w:right w:w="150" w:type="dxa"/>
+            </w:tcMar>
+          </w:tcPr>
+          <w:p>
+            <w:r>
+              <w:rPr>
+                <w:rFonts w:ascii="Consolas" w:hAnsi="Consolas"/>
+                <w:b/>
+                <w:sz w:val="17"/>
+              </w:rPr>
+              <w:t>GET /admin/doctors/:id</w:t>
+            </w:r>
+          </w:p>
+        </w:tc>
+        <w:tc>
+          <w:tcPr>
+            <w:tcW w:type="dxa" w:w="1872"/>
+            <w:tcMar>
+              <w:top w:w="100" w:type="dxa"/>
+              <w:bottom w:w="100" w:type="dxa"/>
+              <w:left w:w="150" w:type="dxa"/>
+              <w:right w:w="150" w:type="dxa"/>
+            </w:tcMar>
+          </w:tcPr>
+          <w:p>
+            <w:r>
+              <w:rPr>
+                <w:sz w:val="18"/>
+              </w:rPr>
+              <w:t>Invalid ObjectId</w:t>
+            </w:r>
+          </w:p>
+        </w:tc>
+        <w:tc>
+          <w:tcPr>
+            <w:tcW w:type="dxa" w:w="2160"/>
+            <w:tcMar>
+              <w:top w:w="100" w:type="dxa"/>
+              <w:bottom w:w="100" w:type="dxa"/>
+              <w:left w:w="150" w:type="dxa"/>
+              <w:right w:w="150" w:type="dxa"/>
+            </w:tcMar>
+          </w:tcPr>
+          <w:p>
+            <w:r>
+              <w:rPr>
+                <w:sz w:val="18"/>
+              </w:rPr>
+              <w:t>400/500 JSON Error</w:t>
+            </w:r>
+          </w:p>
+        </w:tc>
+        <w:tc>
+          <w:tcPr>
+            <w:tcW w:type="dxa" w:w="2880"/>
+            <w:tcMar>
+              <w:top w:w="100" w:type="dxa"/>
+              <w:bottom w:w="100" w:type="dxa"/>
+              <w:left w:w="150" w:type="dxa"/>
+              <w:right w:w="150" w:type="dxa"/>
+            </w:tcMar>
+          </w:tcPr>
+          <w:p>
+            <w:r>
+              <w:rPr>
+                <w:sz w:val="18"/>
+              </w:rPr>
+              <w:t>Verify global error handler response safety</w:t>
+            </w:r>
+          </w:p>
+        </w:tc>
+      </w:tr>
+    </w:tbl>
     <w:p>
       <w:pPr>
         <w:keepNext/>
@@ -263,394 +1321,115 @@
           <w:color w:val="0E7C86"/>
           <w:sz w:val="28"/>
         </w:rPr>
-        <w:t>3. Implementation Visual Gallery (Screenshots)</w:t>
+        <w:t>4. Test Suite Execution Logs</w:t>
       </w:r>
     </w:p>
-    <w:p>
-      <w:pPr>
-        <w:keepNext/>
-        <w:spacing w:before="240" w:after="120"/>
-      </w:pPr>
-      <w:r>
-        <w:rPr>
-          <w:b/>
-          <w:color w:val="2E75B6"/>
-          <w:sz w:val="24"/>
-        </w:rPr>
-        <w:t>A. Administrative Dashboard</w:t>
-      </w:r>
-    </w:p>
-    <w:p>
-      <w:r>
-        <w:t>Displays KPI metrics counters, Recharts weekly clinics activity logs, and unread patient support message cards.</w:t>
-      </w:r>
-    </w:p>
-    <w:p>
-      <w:r>
-        <w:drawing>
-          <wp:inline xmlns:a="http://schemas.openxmlformats.org/drawingml/2006/main" xmlns:pic="http://schemas.openxmlformats.org/drawingml/2006/picture">
-            <wp:extent cx="5486400" cy="2700338"/>
-            <wp:docPr id="1" name="Picture 1"/>
-            <wp:cNvGraphicFramePr>
-              <a:graphicFrameLocks noChangeAspect="1"/>
-            </wp:cNvGraphicFramePr>
-            <a:graphic>
-              <a:graphicData uri="http://schemas.openxmlformats.org/drawingml/2006/picture">
-                <pic:pic>
-                  <pic:nvPicPr>
-                    <pic:cNvPr id="0" name="admin_dashboard_1783353749922.png"/>
-                    <pic:cNvPicPr/>
-                  </pic:nvPicPr>
-                  <pic:blipFill>
-                    <a:blip r:embed="rId9"/>
-                    <a:stretch>
-                      <a:fillRect/>
-                    </a:stretch>
-                  </pic:blipFill>
-                  <pic:spPr>
-                    <a:xfrm>
-                      <a:off x="0" y="0"/>
-                      <a:ext cx="5486400" cy="2700338"/>
-                    </a:xfrm>
-                    <a:prstGeom prst="rect"/>
-                  </pic:spPr>
-                </pic:pic>
-              </a:graphicData>
-            </a:graphic>
-          </wp:inline>
-        </w:drawing>
-      </w:r>
-    </w:p>
-    <w:p>
-      <w:pPr>
-        <w:spacing w:before="120"/>
-      </w:pPr>
-    </w:p>
-    <w:p>
-      <w:pPr>
-        <w:keepNext/>
-        <w:spacing w:before="240" w:after="120"/>
-      </w:pPr>
-      <w:r>
-        <w:rPr>
-          <w:b/>
-          <w:color w:val="2E75B6"/>
-          <w:sz w:val="24"/>
-        </w:rPr>
-        <w:t>B. Doctors Management</w:t>
-      </w:r>
-    </w:p>
-    <w:p>
-      <w:r>
-        <w:t>Loads all seeded doctor profiles from the database, displaying specialty qualifications, schedules, and active switches.</w:t>
-      </w:r>
-    </w:p>
-    <w:p>
-      <w:r>
-        <w:drawing>
-          <wp:inline xmlns:a="http://schemas.openxmlformats.org/drawingml/2006/main" xmlns:pic="http://schemas.openxmlformats.org/drawingml/2006/picture">
-            <wp:extent cx="5486400" cy="2700338"/>
-            <wp:docPr id="2" name="Picture 2"/>
-            <wp:cNvGraphicFramePr>
-              <a:graphicFrameLocks noChangeAspect="1"/>
-            </wp:cNvGraphicFramePr>
-            <a:graphic>
-              <a:graphicData uri="http://schemas.openxmlformats.org/drawingml/2006/picture">
-                <pic:pic>
-                  <pic:nvPicPr>
-                    <pic:cNvPr id="0" name="manage_doctors_seeded_1783355016759.png"/>
-                    <pic:cNvPicPr/>
-                  </pic:nvPicPr>
-                  <pic:blipFill>
-                    <a:blip r:embed="rId10"/>
-                    <a:stretch>
-                      <a:fillRect/>
-                    </a:stretch>
-                  </pic:blipFill>
-                  <pic:spPr>
-                    <a:xfrm>
-                      <a:off x="0" y="0"/>
-                      <a:ext cx="5486400" cy="2700338"/>
-                    </a:xfrm>
-                    <a:prstGeom prst="rect"/>
-                  </pic:spPr>
-                </pic:pic>
-              </a:graphicData>
-            </a:graphic>
-          </wp:inline>
-        </w:drawing>
-      </w:r>
-    </w:p>
-    <w:p>
-      <w:pPr>
-        <w:spacing w:before="120"/>
-      </w:pPr>
-    </w:p>
-    <w:p>
-      <w:pPr>
-        <w:keepNext/>
-        <w:spacing w:before="240" w:after="120"/>
-      </w:pPr>
-      <w:r>
-        <w:rPr>
-          <w:b/>
-          <w:color w:val="2E75B6"/>
-          <w:sz w:val="24"/>
-        </w:rPr>
-        <w:t>C. Pharmacy Catalog Manager</w:t>
-      </w:r>
-    </w:p>
-    <w:p>
-      <w:r>
-        <w:t>Lists stock inventory alerts (low stock warning badges), prices, prescription requirements, and toggles.</w:t>
-      </w:r>
-    </w:p>
-    <w:p>
-      <w:r>
-        <w:drawing>
-          <wp:inline xmlns:a="http://schemas.openxmlformats.org/drawingml/2006/main" xmlns:pic="http://schemas.openxmlformats.org/drawingml/2006/picture">
-            <wp:extent cx="5486400" cy="2700338"/>
-            <wp:docPr id="3" name="Picture 3"/>
-            <wp:cNvGraphicFramePr>
-              <a:graphicFrameLocks noChangeAspect="1"/>
-            </wp:cNvGraphicFramePr>
-            <a:graphic>
-              <a:graphicData uri="http://schemas.openxmlformats.org/drawingml/2006/picture">
-                <pic:pic>
-                  <pic:nvPicPr>
-                    <pic:cNvPr id="0" name="manage_medicines_seeded_1783355046947.png"/>
-                    <pic:cNvPicPr/>
-                  </pic:nvPicPr>
-                  <pic:blipFill>
-                    <a:blip r:embed="rId11"/>
-                    <a:stretch>
-                      <a:fillRect/>
-                    </a:stretch>
-                  </pic:blipFill>
-                  <pic:spPr>
-                    <a:xfrm>
-                      <a:off x="0" y="0"/>
-                      <a:ext cx="5486400" cy="2700338"/>
-                    </a:xfrm>
-                    <a:prstGeom prst="rect"/>
-                  </pic:spPr>
-                </pic:pic>
-              </a:graphicData>
-            </a:graphic>
-          </wp:inline>
-        </w:drawing>
-      </w:r>
-    </w:p>
-    <w:p>
-      <w:pPr>
-        <w:spacing w:before="120"/>
-      </w:pPr>
-    </w:p>
-    <w:p>
-      <w:pPr>
-        <w:keepNext/>
-        <w:spacing w:before="240" w:after="120"/>
-      </w:pPr>
-      <w:r>
-        <w:rPr>
-          <w:b/>
-          <w:color w:val="2E75B6"/>
-          <w:sz w:val="24"/>
-        </w:rPr>
-        <w:t>D. Appointments Tracker</w:t>
-      </w:r>
-    </w:p>
-    <w:p>
-      <w:r>
-        <w:t>Monitors patient time slots, doctor allocations, checkup dates, and transitions appointment states.</w:t>
-      </w:r>
-    </w:p>
-    <w:p>
-      <w:r>
-        <w:drawing>
-          <wp:inline xmlns:a="http://schemas.openxmlformats.org/drawingml/2006/main" xmlns:pic="http://schemas.openxmlformats.org/drawingml/2006/picture">
-            <wp:extent cx="5486400" cy="2700338"/>
-            <wp:docPr id="4" name="Picture 4"/>
-            <wp:cNvGraphicFramePr>
-              <a:graphicFrameLocks noChangeAspect="1"/>
-            </wp:cNvGraphicFramePr>
-            <a:graphic>
-              <a:graphicData uri="http://schemas.openxmlformats.org/drawingml/2006/picture">
-                <pic:pic>
-                  <pic:nvPicPr>
-                    <pic:cNvPr id="0" name="manage_appointments_seeded_1783355101414.png"/>
-                    <pic:cNvPicPr/>
-                  </pic:nvPicPr>
-                  <pic:blipFill>
-                    <a:blip r:embed="rId12"/>
-                    <a:stretch>
-                      <a:fillRect/>
-                    </a:stretch>
-                  </pic:blipFill>
-                  <pic:spPr>
-                    <a:xfrm>
-                      <a:off x="0" y="0"/>
-                      <a:ext cx="5486400" cy="2700338"/>
-                    </a:xfrm>
-                    <a:prstGeom prst="rect"/>
-                  </pic:spPr>
-                </pic:pic>
-              </a:graphicData>
-            </a:graphic>
-          </wp:inline>
-        </w:drawing>
-      </w:r>
-    </w:p>
-    <w:p>
-      <w:pPr>
-        <w:spacing w:before="120"/>
-      </w:pPr>
-    </w:p>
-    <w:p>
-      <w:pPr>
-        <w:keepNext/>
-        <w:spacing w:before="240" w:after="120"/>
-      </w:pPr>
-      <w:r>
-        <w:rPr>
-          <w:b/>
-          <w:color w:val="2E75B6"/>
-          <w:sz w:val="24"/>
-        </w:rPr>
-        <w:t>E. Pharmacy Orders dashboard</w:t>
-      </w:r>
-    </w:p>
-    <w:p>
-      <w:r>
-        <w:t>Displays recipient invoices and coordinates delivery shipping states.</w:t>
-      </w:r>
-    </w:p>
-    <w:p>
-      <w:r>
-        <w:drawing>
-          <wp:inline xmlns:a="http://schemas.openxmlformats.org/drawingml/2006/main" xmlns:pic="http://schemas.openxmlformats.org/drawingml/2006/picture">
-            <wp:extent cx="5486400" cy="2700338"/>
-            <wp:docPr id="5" name="Picture 5"/>
-            <wp:cNvGraphicFramePr>
-              <a:graphicFrameLocks noChangeAspect="1"/>
-            </wp:cNvGraphicFramePr>
-            <a:graphic>
-              <a:graphicData uri="http://schemas.openxmlformats.org/drawingml/2006/picture">
-                <pic:pic>
-                  <pic:nvPicPr>
-                    <pic:cNvPr id="0" name="manage_orders_seeded_1783355125398.png"/>
-                    <pic:cNvPicPr/>
-                  </pic:nvPicPr>
-                  <pic:blipFill>
-                    <a:blip r:embed="rId13"/>
-                    <a:stretch>
-                      <a:fillRect/>
-                    </a:stretch>
-                  </pic:blipFill>
-                  <pic:spPr>
-                    <a:xfrm>
-                      <a:off x="0" y="0"/>
-                      <a:ext cx="5486400" cy="2700338"/>
-                    </a:xfrm>
-                    <a:prstGeom prst="rect"/>
-                  </pic:spPr>
-                </pic:pic>
-              </a:graphicData>
-            </a:graphic>
-          </wp:inline>
-        </w:drawing>
-      </w:r>
-    </w:p>
-    <w:p>
-      <w:pPr>
-        <w:spacing w:before="120"/>
-      </w:pPr>
-    </w:p>
-    <w:p>
-      <w:pPr>
-        <w:keepNext/>
-        <w:spacing w:before="240" w:after="120"/>
-      </w:pPr>
-      <w:r>
-        <w:rPr>
-          <w:b/>
-          <w:color w:val="2E75B6"/>
-          <w:sz w:val="24"/>
-        </w:rPr>
-        <w:t>F. Customer Support Inbox</w:t>
-      </w:r>
-    </w:p>
-    <w:p>
-      <w:r>
-        <w:t>Lists patient inquiries with read/unread status filtering support and review triggers.</w:t>
-      </w:r>
-    </w:p>
-    <w:p>
-      <w:r>
-        <w:drawing>
-          <wp:inline xmlns:a="http://schemas.openxmlformats.org/drawingml/2006/main" xmlns:pic="http://schemas.openxmlformats.org/drawingml/2006/picture">
-            <wp:extent cx="5486400" cy="2700338"/>
-            <wp:docPr id="6" name="Picture 6"/>
-            <wp:cNvGraphicFramePr>
-              <a:graphicFrameLocks noChangeAspect="1"/>
-            </wp:cNvGraphicFramePr>
-            <a:graphic>
-              <a:graphicData uri="http://schemas.openxmlformats.org/drawingml/2006/picture">
-                <pic:pic>
-                  <pic:nvPicPr>
-                    <pic:cNvPr id="0" name="inquiries_messages_seeded_1783355074485.png"/>
-                    <pic:cNvPicPr/>
-                  </pic:nvPicPr>
-                  <pic:blipFill>
-                    <a:blip r:embed="rId14"/>
-                    <a:stretch>
-                      <a:fillRect/>
-                    </a:stretch>
-                  </pic:blipFill>
-                  <pic:spPr>
-                    <a:xfrm>
-                      <a:off x="0" y="0"/>
-                      <a:ext cx="5486400" cy="2700338"/>
-                    </a:xfrm>
-                    <a:prstGeom prst="rect"/>
-                  </pic:spPr>
-                </pic:pic>
-              </a:graphicData>
-            </a:graphic>
-          </wp:inline>
-        </w:drawing>
-      </w:r>
-    </w:p>
-    <w:p>
-      <w:pPr>
-        <w:spacing w:before="120"/>
-      </w:pPr>
-    </w:p>
-    <w:p>
-      <w:pPr>
-        <w:keepNext/>
-        <w:spacing w:before="360" w:after="160"/>
-      </w:pPr>
-      <w:r>
-        <w:rPr>
-          <w:b/>
-          <w:color w:val="0E7C86"/>
-          <w:sz w:val="28"/>
-        </w:rPr>
-        <w:t>4. Next Objective</w:t>
-      </w:r>
-    </w:p>
-    <w:p>
-      <w:r>
-        <w:t>All five development phases have been successfully implemented and validated. The next objective is **Phase 6: QA Auditing &amp; Test Scenarios**:</w:t>
-        <w:br/>
-        <w:t>• Establish formal automated test scripts mapping API endpoint status changes.</w:t>
-        <w:br/>
-        <w:t>• Run regression suites across doctor/medicine deactivation checks.</w:t>
-        <w:br/>
-        <w:t>• Document boundary test results under extreme loads and database drops.</w:t>
-      </w:r>
-    </w:p>
+    <w:tbl>
+      <w:tblPr>
+        <w:tblW w:type="auto" w:w="0"/>
+        <w:tblLook w:firstColumn="1" w:firstRow="1" w:lastColumn="0" w:lastRow="0" w:noHBand="0" w:noVBand="1" w:val="04A0"/>
+      </w:tblPr>
+      <w:tblGrid>
+        <w:gridCol w:w="9360"/>
+      </w:tblGrid>
+      <w:tr>
+        <w:tc>
+          <w:tcPr>
+            <w:tcW w:type="dxa" w:w="9360"/>
+            <w:shd w:fill="F4F9F9"/>
+            <w:tcMar>
+              <w:top w:w="100" w:type="dxa"/>
+              <w:bottom w:w="100" w:type="dxa"/>
+              <w:left w:w="150" w:type="dxa"/>
+              <w:right w:w="150" w:type="dxa"/>
+            </w:tcMar>
+          </w:tcPr>
+          <w:p>
+            <w:pPr>
+              <w:spacing w:line="276" w:lineRule="auto"/>
+            </w:pPr>
+            <w:r>
+              <w:rPr>
+                <w:rFonts w:ascii="Consolas" w:hAnsi="Consolas"/>
+                <w:color w:val="3C3C3C"/>
+                <w:sz w:val="17"/>
+              </w:rPr>
+              <w:t>🧪 Starting QA Audit Test Orchestrator...</w:t>
+              <w:br/>
+              <w:t>🌱 Seeding test database...</w:t>
+              <w:br/>
+              <w:t>[Seed] MongoDB Connected: 127.0.0.1</w:t>
+              <w:br/>
+              <w:t>[Seed] Database cleared.</w:t>
+              <w:br/>
+              <w:t>[Seed] Seeded default users, doctors, medicines, blogs, and transactional logs.</w:t>
+              <w:br/>
+              <w:t>🚀 Spawning Express API server on port 5999...</w:t>
+              <w:br/>
+              <w:t>[Server] Server running on http://localhost:5999</w:t>
+              <w:br/>
+              <w:t>🧪 Executing integration test suite...</w:t>
+              <w:br/>
+              <w:t>TAP version 13</w:t>
+              <w:br/>
+              <w:t># Subtest: GET /admin/doctors without token returns 401</w:t>
+              <w:br/>
+              <w:t>ok 1 - GET /admin/doctors without token returns 401</w:t>
+              <w:br/>
+              <w:t># Subtest: GET /admin/doctors with patient token returns 403</w:t>
+              <w:br/>
+              <w:t>ok 2 - GET /admin/doctors with patient token returns 403</w:t>
+              <w:br/>
+              <w:t># Subtest: Admin login is successful and returns 200</w:t>
+              <w:br/>
+              <w:t>ok 3 - Admin login is successful and returns 200</w:t>
+              <w:br/>
+              <w:t># Subtest: Retrieve appointments and update status to confirmed</w:t>
+              <w:br/>
+              <w:t>ok 4 - Retrieve appointments and update status to confirmed</w:t>
+              <w:br/>
+              <w:t># Subtest: Retrieve orders and update status to processing</w:t>
+              <w:br/>
+              <w:t>ok 5 - Retrieve orders and update status to processing</w:t>
+              <w:br/>
+              <w:t># Subtest: Retrieve lab bookings and update status to cancelled</w:t>
+              <w:br/>
+              <w:t>ok 6 - Retrieve lab bookings and update status to cancelled</w:t>
+              <w:br/>
+              <w:t># Subtest: Soft-delete doctor verifies isActive is set to false</w:t>
+              <w:br/>
+              <w:t>ok 7 - Soft-delete doctor verifies isActive is set to false</w:t>
+              <w:br/>
+              <w:t># Subtest: Soft-delete medicine verifies isActive is set to false</w:t>
+              <w:br/>
+              <w:t>ok 8 - Soft-delete medicine verifies isActive is set to false</w:t>
+              <w:br/>
+              <w:t># Subtest: Create doctor with missing name fails with 400</w:t>
+              <w:br/>
+              <w:t>ok 9 - Create doctor with missing name fails with 400</w:t>
+              <w:br/>
+              <w:t># Subtest: Create medicine with negative price fails with 400 or 500</w:t>
+              <w:br/>
+              <w:t>ok 10 - Create medicine with negative price fails with 400 or 500</w:t>
+              <w:br/>
+              <w:t># Subtest: Fetch non-existent doctor with invalid ID returns proper JSON error structure</w:t>
+              <w:br/>
+              <w:t>ok 11 - Fetch non-existent doctor with invalid ID returns proper JSON error structure</w:t>
+              <w:br/>
+              <w:t>1..11</w:t>
+              <w:br/>
+              <w:t># tests 11</w:t>
+              <w:br/>
+              <w:t># pass 11</w:t>
+              <w:br/>
+              <w:t># fail 0</w:t>
+              <w:br/>
+              <w:t>🧹 Tearing down Express server...</w:t>
+            </w:r>
+          </w:p>
+        </w:tc>
+      </w:tr>
+    </w:tbl>
     <w:sectPr>
       <w:pgSz w:w="12240" w:h="15840"/>
       <w:pgMar w:top="1440" w:right="1440" w:bottom="1440" w:left="1440" w:header="720" w:footer="720" w:gutter="0"/>

</xml_diff>